<commit_message>
Align IFS 143/144/145 and EFS 087/207: names, versions, TIBCO/iShift split, IDoc sequence independence, typos
Co-Authored-By: Claude Sonnet 5.5 <noreply@anthropic.com>
Claude-Session: https://claude.ai/code/session_01QKU1LiJXqVwAwQieEj9dkd
</commit_message>
<xml_diff>
--- a/docs/EFS_P2P_087-Promo_Item-Goods_Receipt_Replication_from_S4_to_eBuy.docx
+++ b/docs/EFS_P2P_087-Promo_Item-Goods_Receipt_Replication_from_S4_to_eBuy.docx
@@ -17,7 +17,7 @@
           <w:b/>
           <w:sz w:val="28"/>
         </w:rPr>
-        <w:t xml:space="preserve">Extension Functional Specification Design document</w:t>
+        <w:t>Extension Functional Specification Design document</w:t>
       </w:r>
     </w:p>
     <w:p>
@@ -76,7 +76,7 @@
           <w:b/>
           <w:sz w:val="28"/>
         </w:rPr>
-        <w:t xml:space="preserve">FSD: EFS_P2P_087- Promotional Items - Goods Receipt Replication interface from S4 to eBuy Coupa</w:t>
+        <w:t>FSD: EFS_P2P_087- Promotional Items - Goods Receipt Replication interface from S4 to eBuy Coupa</w:t>
       </w:r>
     </w:p>
     <w:p>
@@ -339,7 +339,7 @@
               <w:rPr>
                 <w:rFonts w:cs="Arial"/>
               </w:rPr>
-              <w:t xml:space="preserve">P2P_02_02-NCOGS Goods Receipt Creation / Cancellation</w:t>
+              <w:t>P2P_02_02-NCOGS Goods Receipt Creation / Cancellation</w:t>
             </w:r>
           </w:p>
         </w:tc>
@@ -687,7 +687,7 @@
               <w:rPr>
                 <w:sz w:val="18"/>
               </w:rPr>
-              <w:t>V0.1</w:t>
+              <w:t xml:space="preserve">V1.0</w:t>
             </w:r>
           </w:p>
         </w:tc>
@@ -800,7 +800,7 @@
               <w:rPr>
                 <w:sz w:val="18"/>
               </w:rPr>
-              <w:t>V0.2</w:t>
+              <w:t xml:space="preserve">V2.0</w:t>
             </w:r>
           </w:p>
         </w:tc>
@@ -919,7 +919,7 @@
               <w:rPr>
                 <w:sz w:val="18"/>
               </w:rPr>
-              <w:t>V0.3</w:t>
+              <w:t xml:space="preserve">V3.0</w:t>
             </w:r>
           </w:p>
         </w:tc>
@@ -978,7 +978,7 @@
                 <w:rFonts w:cs="Arial"/>
                 <w:sz w:val="18"/>
               </w:rPr>
-              <w:t>Badre EL Mouksit</w:t>
+              <w:t>El Mouksit Badre</w:t>
             </w:r>
           </w:p>
         </w:tc>
@@ -1018,7 +1018,7 @@
               <w:rPr>
                 <w:sz w:val="18"/>
               </w:rPr>
-              <w:t xml:space="preserve">ISHRPM-285</w:t>
+              <w:t xml:space="preserve">ROISHGSA-28232 / ISHRPM-285</w:t>
             </w:r>
           </w:p>
         </w:tc>
@@ -1038,7 +1038,7 @@
               <w:rPr>
                 <w:sz w:val="18"/>
               </w:rPr>
-              <w:t xml:space="preserve">V0.4</w:t>
+              <w:t xml:space="preserve">V4.0</w:t>
             </w:r>
           </w:p>
         </w:tc>
@@ -1059,7 +1059,7 @@
               <w:rPr>
                 <w:sz w:val="18"/>
               </w:rPr>
-              <w:t xml:space="preserve">14/10/2026</w:t>
+              <w:t xml:space="preserve">15/10/2026</w:t>
             </w:r>
           </w:p>
         </w:tc>
@@ -1075,25 +1075,33 @@
                 <w:sz w:val="18"/>
               </w:rPr>
             </w:pPr>
-          </w:p>
-        </w:tc>
-        <w:tc>
-          <w:tcPr>
-            <w:tcW w:w="2268" w:type="dxa"/>
-          </w:tcPr>
-          <w:p>
-            <w:pPr>
+            <w:r>
               <w:rPr>
                 <w:i/>
                 <w:color w:val="5B9BD5" w:themeColor="accent1"/>
                 <w:sz w:val="18"/>
               </w:rPr>
-            </w:pPr>
-            <w:r>
-              <w:rPr>
+              <w:t xml:space="preserve">Updated</w:t>
+            </w:r>
+          </w:p>
+        </w:tc>
+        <w:tc>
+          <w:tcPr>
+            <w:tcW w:w="2268" w:type="dxa"/>
+          </w:tcPr>
+          <w:p>
+            <w:pPr>
+              <w:rPr>
+                <w:i/>
+                <w:color w:val="5B9BD5" w:themeColor="accent1"/>
                 <w:sz w:val="18"/>
               </w:rPr>
-              <w:t xml:space="preserve">Badre EL Mouksit</w:t>
+            </w:pPr>
+            <w:r>
+              <w:rPr>
+                <w:sz w:val="18"/>
+              </w:rPr>
+              <w:t xml:space="preserve">El Mouksit Badre</w:t>
             </w:r>
           </w:p>
         </w:tc>
@@ -1261,7 +1269,6 @@
               <w:rPr>
                 <w:b/>
               </w:rPr>
-              <w:lastRenderedPageBreak/>
               <w:t>HISTORY</w:t>
             </w:r>
           </w:p>
@@ -1498,14 +1505,7 @@
               <w:rPr>
                 <w:sz w:val="18"/>
               </w:rPr>
-              <w:t xml:space="preserve">ISHNAP-5479 - 7</w:t>
-            </w:r>
-            <w:r>
-              <w:rPr>
-                <w:rFonts w:cs="Arial"/>
-                <w:sz w:val="18"/>
-              </w:rPr>
-              <w:t>Document Initialization</w:t>
+              <w:t xml:space="preserve">ISHNAP-5479 - Document Initialization</w:t>
             </w:r>
           </w:p>
         </w:tc>
@@ -1626,14 +1626,7 @@
               <w:rPr>
                 <w:sz w:val="18"/>
               </w:rPr>
-              <w:t xml:space="preserve">ISHNAP-5479 - </w:t>
-            </w:r>
-            <w:r>
-              <w:rPr>
-                <w:rFonts w:cs="Arial"/>
-                <w:sz w:val="18"/>
-              </w:rPr>
-              <w:t xml:space="preserve">To include the modification of FMZPTP_AC_GR_SEGMNT_DATA and CAT01 table</w:t>
+              <w:t xml:space="preserve">ISHNAP-5479 - To include the modification of FM ZPTP_AC_GR_SEGMNT_DATA and CAT01 table</w:t>
             </w:r>
           </w:p>
         </w:tc>
@@ -1710,7 +1703,7 @@
                 <w:rFonts w:cs="Arial"/>
                 <w:sz w:val="18"/>
               </w:rPr>
-              <w:t>Badre El Mouksit</w:t>
+              <w:t>El Mouksit Badre</w:t>
             </w:r>
           </w:p>
         </w:tc>
@@ -1758,14 +1751,7 @@
               <w:rPr>
                 <w:sz w:val="18"/>
               </w:rPr>
-              <w:t xml:space="preserve">ISHCHCMP-22890- </w:t>
-            </w:r>
-            <w:r>
-              <w:rPr>
-                <w:rFonts w:cs="Arial"/>
-                <w:sz w:val="18"/>
-              </w:rPr>
-              <w:t xml:space="preserve">To include the modification of FMZPTP_AC_GR_SEGMNT_DATA and CAT01 table</w:t>
+              <w:t xml:space="preserve">ISHCHCMP-22890 - To include the modification of FM ZPTP_AC_GR_SEGMNT_DATA and CAT01 table</w:t>
             </w:r>
           </w:p>
         </w:tc>
@@ -1791,7 +1777,7 @@
               <w:rPr>
                 <w:sz w:val="18"/>
               </w:rPr>
-              <w:t xml:space="preserve">V4.0</w:t>
+              <w:t>V4.0</w:t>
             </w:r>
           </w:p>
         </w:tc>
@@ -1812,7 +1798,7 @@
               <w:rPr>
                 <w:sz w:val="18"/>
               </w:rPr>
-              <w:t xml:space="preserve">14/10/2026</w:t>
+              <w:t xml:space="preserve">15/10/2026</w:t>
             </w:r>
           </w:p>
         </w:tc>
@@ -1833,7 +1819,7 @@
               <w:rPr>
                 <w:sz w:val="18"/>
               </w:rPr>
-              <w:t xml:space="preserve">Badre El Mouksit</w:t>
+              <w:t>El Mouksit Badre</w:t>
             </w:r>
           </w:p>
         </w:tc>
@@ -1854,7 +1840,7 @@
               <w:rPr>
                 <w:sz w:val="18"/>
               </w:rPr>
-              <w:t xml:space="preserve">3.3. SAP function to enhance</w:t>
+              <w:t>3.3. SAP function to enhance</w:t>
             </w:r>
           </w:p>
         </w:tc>
@@ -1882,7 +1868,7 @@
               <w:rPr>
                 <w:sz w:val="18"/>
               </w:rPr>
-              <w:t xml:space="preserve">ISHRPM-285 - IDoc settings (Typinfo, Partner, Address) for IFS_P2P_143 (INVOIC02 / ZINVOIC02_EXT) and IFS_P2P_144 (ACC_DOCUMENT04): message variant HRS, SADR sender HRS</w:t>
+              <w:t xml:space="preserve">ROISHGSA-28232 / ISHRPM-285 - IDoc settings (Typinfo, Partner, Address) for IFS_P2P_143 (INVOIC02 / ZINVOIC02_EXT) and IFS_P2P_144 (ACC_DOCUMENT04): message variant HRS, SADR sender HRS.</w:t>
             </w:r>
           </w:p>
         </w:tc>
@@ -2282,9 +2268,11 @@
             <w:r>
               <w:rPr>
                 <w:rFonts w:cs="Arial"/>
+                <w:i/>
+                <w:color w:val="2F5496" w:themeColor="accent5" w:themeShade="BF"/>
                 <w:sz w:val="18"/>
               </w:rPr>
-              <w:t>IFS_P2P_096</w:t>
+              <w:t xml:space="preserve">IFS_P2P_143</w:t>
             </w:r>
           </w:p>
         </w:tc>
@@ -2305,7 +2293,7 @@
                 <w:rFonts w:cs="Arial"/>
                 <w:sz w:val="18"/>
               </w:rPr>
-              <w:t xml:space="preserve">Promotional Items - Goods Receipt Replication interface from S4 to eBuy Coupa</w:t>
+              <w:t xml:space="preserve">Citibank HRS incoming invoices (INVOIC02 / ZINVOIC02_EXT)</w:t>
             </w:r>
           </w:p>
         </w:tc>
@@ -2327,7 +2315,7 @@
                 <w:rFonts w:cs="Arial"/>
                 <w:sz w:val="18"/>
               </w:rPr>
-              <w:t xml:space="preserve">Soldoc Project track</w:t>
+              <w:t xml:space="preserve">JIRA ROISHGSA-23607</w:t>
             </w:r>
           </w:p>
         </w:tc>
@@ -2351,9 +2339,10 @@
             </w:pPr>
             <w:r>
               <w:rPr>
+                <w:rFonts w:cs="Arial"/>
                 <w:sz w:val="18"/>
               </w:rPr>
-              <w:t xml:space="preserve">IFS_P2P_143</w:t>
+              <w:t xml:space="preserve">IFS_P2P_144</w:t>
             </w:r>
           </w:p>
         </w:tc>
@@ -2372,9 +2361,10 @@
             </w:pPr>
             <w:r>
               <w:rPr>
+                <w:rFonts w:cs="Arial"/>
                 <w:sz w:val="18"/>
               </w:rPr>
-              <w:t xml:space="preserve">Citibank HRS incoming invoices – INVOIC02 / ZINVOIC02_EXT IDoc posted via SAP VIM</w:t>
+              <w:t xml:space="preserve">Citibank HRS reclassification document (ACC_DOCUMENT04)</w:t>
             </w:r>
           </w:p>
         </w:tc>
@@ -2396,9 +2386,12 @@
             </w:pPr>
             <w:r>
               <w:rPr>
+                <w:rFonts w:ascii="Arial" w:hAnsi="Arial" w:cs="Arial"/>
                 <w:sz w:val="18"/>
-              </w:rPr>
-              <w:t xml:space="preserve">JIRA ROISHGSA-23607</w:t>
+                <w:szCs w:val="24"/>
+                <w:lang w:eastAsia="fr-FR"/>
+              </w:rPr>
+              <w:t xml:space="preserve">JIRA ROISHGSA-23616</w:t>
             </w:r>
           </w:p>
         </w:tc>
@@ -2424,9 +2417,12 @@
             </w:pPr>
             <w:r>
               <w:rPr>
+                <w:rFonts w:cs="Arial"/>
+                <w:i/>
+                <w:color w:val="2F5496" w:themeColor="accent5" w:themeShade="BF"/>
                 <w:sz w:val="18"/>
               </w:rPr>
-              <w:t xml:space="preserve">IFS_P2P_144</w:t>
+              <w:t xml:space="preserve">EFS_P2P_207</w:t>
             </w:r>
           </w:p>
         </w:tc>
@@ -2441,13 +2437,16 @@
               <w:rPr>
                 <w:rFonts w:cs="Arial"/>
                 <w:sz w:val="18"/>
-              </w:rPr>
-            </w:pPr>
-            <w:r>
-              <w:rPr>
+                <w:lang w:val="fr-FR"/>
+              </w:rPr>
+            </w:pPr>
+            <w:r>
+              <w:rPr>
+                <w:rFonts w:cs="Arial"/>
                 <w:sz w:val="18"/>
-              </w:rPr>
-              <w:t xml:space="preserve">Citibank HRS reclassification document – ACC_DOCUMENT04 IDoc</w:t>
+                <w:lang w:val="fr-FR"/>
+              </w:rPr>
+              <w:t xml:space="preserve">Citibank HRS reclassification – iShift configuration and new program</w:t>
             </w:r>
           </w:p>
         </w:tc>
@@ -2467,9 +2466,10 @@
             </w:pPr>
             <w:r>
               <w:rPr>
+                <w:rFonts w:cs="Arial"/>
                 <w:sz w:val="18"/>
               </w:rPr>
-              <w:t xml:space="preserve">JIRA ROISHGSA-23616</w:t>
+              <w:t xml:space="preserve">JIRA ROISHGSA-28223</w:t>
             </w:r>
           </w:p>
         </w:tc>
@@ -2691,7 +2691,7 @@
               <w:fldChar w:fldCharType="begin"/>
               <w:instrText xml:space="preserve"> PAGEREF _Toc143435744 \h </w:instrText>
               <w:fldChar w:fldCharType="separate"/>
-              <w:t>4</w:t>
+              <w:t>3</w:t>
               <w:fldChar w:fldCharType="end"/>
             </w:r>
           </w:hyperlink>
@@ -2721,7 +2721,7 @@
               <w:fldChar w:fldCharType="begin"/>
               <w:instrText xml:space="preserve"> PAGEREF _Toc143435745 \h </w:instrText>
               <w:fldChar w:fldCharType="separate"/>
-              <w:t>4</w:t>
+              <w:t>3</w:t>
               <w:fldChar w:fldCharType="end"/>
             </w:r>
           </w:hyperlink>
@@ -2751,7 +2751,7 @@
               <w:fldChar w:fldCharType="begin"/>
               <w:instrText xml:space="preserve"> PAGEREF _Toc143435746 \h </w:instrText>
               <w:fldChar w:fldCharType="separate"/>
-              <w:t>4</w:t>
+              <w:t>3</w:t>
               <w:fldChar w:fldCharType="end"/>
             </w:r>
           </w:hyperlink>
@@ -2781,7 +2781,7 @@
               <w:fldChar w:fldCharType="begin"/>
               <w:instrText xml:space="preserve"> PAGEREF _Toc143435747 \h </w:instrText>
               <w:fldChar w:fldCharType="separate"/>
-              <w:t>4</w:t>
+              <w:t>3</w:t>
               <w:fldChar w:fldCharType="end"/>
             </w:r>
           </w:hyperlink>
@@ -2818,7 +2818,7 @@
               <w:fldChar w:fldCharType="begin"/>
               <w:instrText xml:space="preserve"> PAGEREF _Toc143435748 \h </w:instrText>
               <w:fldChar w:fldCharType="separate"/>
-              <w:t>5</w:t>
+              <w:t>4</w:t>
               <w:fldChar w:fldCharType="end"/>
             </w:r>
           </w:hyperlink>
@@ -2878,7 +2878,7 @@
               <w:fldChar w:fldCharType="begin"/>
               <w:instrText xml:space="preserve"> PAGEREF _Toc143435750 \h </w:instrText>
               <w:fldChar w:fldCharType="separate"/>
-              <w:t>6</w:t>
+              <w:t>5</w:t>
               <w:fldChar w:fldCharType="end"/>
             </w:r>
           </w:hyperlink>
@@ -2938,7 +2938,7 @@
               <w:fldChar w:fldCharType="begin"/>
               <w:instrText xml:space="preserve"> PAGEREF _Toc143435752 \h </w:instrText>
               <w:fldChar w:fldCharType="separate"/>
-              <w:t>7</w:t>
+              <w:t>6</w:t>
               <w:fldChar w:fldCharType="end"/>
             </w:r>
           </w:hyperlink>
@@ -3158,7 +3158,7 @@
               <w:fldChar w:fldCharType="begin"/>
               <w:instrText xml:space="preserve"> PAGEREF _Toc143435759 \h </w:instrText>
               <w:fldChar w:fldCharType="separate"/>
-              <w:t>8</w:t>
+              <w:t>12</w:t>
               <w:fldChar w:fldCharType="end"/>
             </w:r>
           </w:hyperlink>
@@ -3188,7 +3188,7 @@
               <w:fldChar w:fldCharType="begin"/>
               <w:instrText xml:space="preserve"> PAGEREF _Toc143435760 \h </w:instrText>
               <w:fldChar w:fldCharType="separate"/>
-              <w:t>9</w:t>
+              <w:t>12</w:t>
               <w:fldChar w:fldCharType="end"/>
             </w:r>
           </w:hyperlink>
@@ -3218,7 +3218,7 @@
               <w:fldChar w:fldCharType="begin"/>
               <w:instrText xml:space="preserve"> PAGEREF _Toc143435761 \h </w:instrText>
               <w:fldChar w:fldCharType="separate"/>
-              <w:t>9</w:t>
+              <w:t>12</w:t>
               <w:fldChar w:fldCharType="end"/>
             </w:r>
           </w:hyperlink>
@@ -3248,7 +3248,7 @@
               <w:fldChar w:fldCharType="begin"/>
               <w:instrText xml:space="preserve"> PAGEREF _Toc143435762 \h </w:instrText>
               <w:fldChar w:fldCharType="separate"/>
-              <w:t>9</w:t>
+              <w:t>12</w:t>
               <w:fldChar w:fldCharType="end"/>
             </w:r>
           </w:hyperlink>
@@ -3287,7 +3287,7 @@
               <w:fldChar w:fldCharType="begin"/>
               <w:instrText xml:space="preserve"> PAGEREF _Toc143435763 \h </w:instrText>
               <w:fldChar w:fldCharType="separate"/>
-              <w:t>9</w:t>
+              <w:t>13</w:t>
               <w:fldChar w:fldCharType="end"/>
             </w:r>
           </w:hyperlink>
@@ -3324,7 +3324,7 @@
               <w:fldChar w:fldCharType="begin"/>
               <w:instrText xml:space="preserve"> PAGEREF _Toc143435764 \h </w:instrText>
               <w:fldChar w:fldCharType="separate"/>
-              <w:t>9</w:t>
+              <w:t>13</w:t>
               <w:fldChar w:fldCharType="end"/>
             </w:r>
           </w:hyperlink>
@@ -3361,7 +3361,7 @@
               <w:fldChar w:fldCharType="begin"/>
               <w:instrText xml:space="preserve"> PAGEREF _Toc143435765 \h </w:instrText>
               <w:fldChar w:fldCharType="separate"/>
-              <w:t>10</w:t>
+              <w:t>13</w:t>
               <w:fldChar w:fldCharType="end"/>
             </w:r>
           </w:hyperlink>
@@ -3398,7 +3398,7 @@
               <w:fldChar w:fldCharType="begin"/>
               <w:instrText xml:space="preserve"> PAGEREF _Toc143435766 \h </w:instrText>
               <w:fldChar w:fldCharType="separate"/>
-              <w:t>10</w:t>
+              <w:t>13</w:t>
               <w:fldChar w:fldCharType="end"/>
             </w:r>
           </w:hyperlink>
@@ -3435,7 +3435,7 @@
               <w:fldChar w:fldCharType="begin"/>
               <w:instrText xml:space="preserve"> PAGEREF _Toc143435767 \h </w:instrText>
               <w:fldChar w:fldCharType="separate"/>
-              <w:t>10</w:t>
+              <w:t>13</w:t>
               <w:fldChar w:fldCharType="end"/>
             </w:r>
           </w:hyperlink>
@@ -3581,7 +3581,7 @@
           <w:rFonts w:eastAsia="Times New Roman" w:cs="Arial"/>
           <w:color w:val="000000"/>
         </w:rPr>
-        <w:t xml:space="preserve">This Functional Specifications (IFS) document defines the core model design, with all required functional details and business rules, for Promotional Items Good Receipts creation and Good Receipt cancellation from SHIFT ERP to EBUY/COUPA.</w:t>
+        <w:t>This Functional Specifications (IFS) document defines the core model design, with all required functional details and business rules, for Promotional Items Good Receipts creation and Good Receipt cancellation from SHIFT ERP to EBUY/COUPA.</w:t>
       </w:r>
     </w:p>
     <w:p>
@@ -3651,7 +3651,7 @@
           <w:rFonts w:eastAsia="Times New Roman" w:cs="Arial"/>
           <w:color w:val="000000"/>
         </w:rPr>
-        <w:t xml:space="preserve">This enhancement/interface allows to send the GRs creation/cancellation from Shift to eBuy.</w:t>
+        <w:t>This enhancement/interface allows to send the GRs creation/cancellation from Shift to eBuy.</w:t>
       </w:r>
     </w:p>
     <w:p>
@@ -5219,7 +5219,7 @@
       </w:pPr>
       <w:bookmarkStart w:id="7" w:name="_Toc143435748"/>
       <w:r>
-        <w:t xml:space="preserve">Functional specifications</w:t>
+        <w:t>Functional specifications</w:t>
       </w:r>
       <w:bookmarkEnd w:id="7"/>
     </w:p>
@@ -5371,7 +5371,7 @@
           <w:rFonts w:eastAsia="Times New Roman" w:cs="Arial"/>
           <w:color w:val="000000"/>
         </w:rPr>
-        <w:t xml:space="preserve">PO should exist in Shift, GR creation/cancellation to be replicated to eBuy. Master data should be aligned between systems.</w:t>
+        <w:t>PO should exist in Shift, GR creation/cancellation to be replicated to eBuy. Master data should be aligned between systems.</w:t>
       </w:r>
     </w:p>
     <w:p>
@@ -5571,7 +5571,7 @@
           <w:rFonts w:eastAsia="Times New Roman" w:cs="Arial"/>
           <w:color w:val="000000"/>
         </w:rPr>
-        <w:t xml:space="preserve">eBuy iPaas is responsible for the value mappings and transformation to the target format.</w:t>
+        <w:t>eBuy iPaas is responsible for the value mappings and transformation to the target format.</w:t>
       </w:r>
     </w:p>
     <w:p>
@@ -5713,7 +5713,7 @@
           <w:sz w:val="22"/>
           <w:szCs w:val="22"/>
         </w:rPr>
-        <w:t xml:space="preserve">Any GRs performed in eBuy should be blocked and will not be interfaced to SHIFT.</w:t>
+        <w:t>Any GRs performed in eBuy should be blocked and will not be interfaced to SHIFT.</w:t>
       </w:r>
     </w:p>
     <w:p>
@@ -5773,7 +5773,7 @@
           <w:sz w:val="22"/>
           <w:szCs w:val="22"/>
         </w:rPr>
-        <w:t xml:space="preserve">If two idocs have been sent for the same GR number, the second one will be ignored by eBuy Coupa.</w:t>
+        <w:t>If two idocs have been sent for the same GR number, the second one will be ignored by eBuy Coupa.</w:t>
       </w:r>
     </w:p>
     <w:p>
@@ -5830,7 +5830,7 @@
           <w:rFonts w:eastAsia="Times New Roman" w:cs="Arial"/>
           <w:color w:val="000000"/>
         </w:rPr>
-        <w:t xml:space="preserve">This IFS only concerns the GR for the Promotional Items, with SAP Material type = ZPRO. This interface should not allow any other GRs to flow from S4 to eBuy Coupa.</w:t>
+        <w:t>This IFS only concerns the GR for the Promotional Items, with SAP Material type = ZPRO. This interface should not allow any other GRs to flow from S4 to eBuy Coupa.</w:t>
       </w:r>
     </w:p>
     <w:p>
@@ -5852,7 +5852,7 @@
           <w:rFonts w:eastAsia="Times New Roman" w:cs="Arial"/>
           <w:color w:val="000000"/>
         </w:rPr>
-        <w:t xml:space="preserve">EBUY/COUPA Purchase order replication is not covered in the interface. They will be replicated through Purchase order interface, with respect to the Good Receipts which are replicated in Shift already from eBuy/Coupa.</w:t>
+        <w:t>EBUY/COUPA Purchase order replication is not covered in the interface. They will be replicated through Purchase order interface, with respect to the Good Receipts which are replicated in Shift already from eBuy/Coupa.</w:t>
       </w:r>
     </w:p>
     <w:p>
@@ -5995,7 +5995,7 @@
           <w:color w:val="000000"/>
         </w:rPr>
         <w:drawing>
-          <wp:inline distT="0" distB="0" distL="0" distR="0" wp14:anchorId="76288229" wp14:editId="7C7F780C">
+          <wp:inline distT="0" distB="0" distL="0" distR="0" wp14:anchorId="76288229" wp14:editId="40DA365B">
             <wp:extent cx="5943600" cy="1739826"/>
             <wp:effectExtent l="0" t="0" r="0" b="0"/>
             <wp:docPr id="32" name="Picture 32"/>
@@ -6012,7 +6012,7 @@
                     </pic:cNvPicPr>
                   </pic:nvPicPr>
                   <pic:blipFill rotWithShape="1">
-                    <a:blip r:embed="rId11" cstate="print">
+                    <a:blip r:embed="rId13" cstate="print">
                       <a:extLst>
                         <a:ext uri="{28A0092B-C50C-407E-A947-70E740481C1C}">
                           <a14:useLocalDpi xmlns:a14="http://schemas.microsoft.com/office/drawing/2010/main" val="0"/>
@@ -6109,7 +6109,7 @@
             <wp:cNvGraphicFramePr/>
             <a:graphic xmlns:a="http://schemas.openxmlformats.org/drawingml/2006/main">
               <a:graphicData uri="http://schemas.openxmlformats.org/drawingml/2006/diagram">
-                <dgm:relIds xmlns:dgm="http://schemas.openxmlformats.org/drawingml/2006/diagram" xmlns:r="http://schemas.openxmlformats.org/officeDocument/2006/relationships" r:dm="rId12" r:lo="rId13" r:qs="rId14" r:cs="rId15"/>
+                <dgm:relIds xmlns:dgm="http://schemas.openxmlformats.org/drawingml/2006/diagram" xmlns:r="http://schemas.openxmlformats.org/officeDocument/2006/relationships" r:dm="rId14" r:lo="rId15" r:qs="rId16" r:cs="rId17"/>
               </a:graphicData>
             </a:graphic>
           </wp:inline>
@@ -6158,7 +6158,7 @@
         <w:jc w:val="both"/>
       </w:pPr>
       <w:r>
-        <w:t xml:space="preserve">The enhacement purpose is to create a new Partner profile specific for eBuy to send the GRs creation/cancellation from Shift to eBuy. </w:t>
+        <w:t xml:space="preserve">The enhancement purpose is to create a new Partner profile specific for eBuy to send the GRs creation/cancellation from Shift to eBuy. </w:t>
       </w:r>
     </w:p>
     <w:p>
@@ -6183,7 +6183,7 @@
         </w:rPr>
       </w:pPr>
       <w:r>
-        <w:t xml:space="preserve">The Partner profile should be similar to the one existing for Leo for the interface: IFS_P2P_072- Promo Items - Goods Receipt Replication interface from S4 to COUPA LEO</w:t>
+        <w:t>The Partner profile should be similar to the one existing for Leo for the interface: IFS_P2P_072- Promo Items - Goods Receipt Replication interface from S4 to COUPA LEO</w:t>
       </w:r>
     </w:p>
     <w:p>
@@ -6197,7 +6197,7 @@
       </w:pPr>
       <w:bookmarkStart w:id="18" w:name="_Toc143435754"/>
       <w:r>
-        <w:t xml:space="preserve">2.5.1 Custom tables</w:t>
+        <w:t>2.5.1 Custom tables</w:t>
       </w:r>
       <w:bookmarkEnd w:id="18"/>
       <w:r>
@@ -6224,7 +6224,7 @@
         <w:jc w:val="both"/>
       </w:pPr>
       <w:r>
-        <w:t xml:space="preserve">ZUT_T_CAT01 entries to be maintained, details in the section 3.3. SAP Function to enhance</w:t>
+        <w:t>ZUT_T_CAT01 entries to be maintained, details in the section 3.3. SAP Function to enhance</w:t>
       </w:r>
     </w:p>
     <w:p>
@@ -6291,7 +6291,7 @@
       <w:bookmarkStart w:id="19" w:name="_Toc143435755"/>
       <w:r>
         <w:lastRenderedPageBreak/>
-        <w:t xml:space="preserve">Extension Detailed Specification</w:t>
+        <w:t>Extension Detailed Specification</w:t>
       </w:r>
       <w:bookmarkEnd w:id="19"/>
     </w:p>
@@ -6420,7 +6420,7 @@
                 <w:sz w:val="20"/>
                 <w:szCs w:val="20"/>
               </w:rPr>
-              <w:t xml:space="preserve">Good receipt (Promo items) replication interface - from S4HANA to eBuy/Coupa</w:t>
+              <w:t>Good receipt (Promo items) replication interface - from S4HANA to eBuy/Coupa</w:t>
             </w:r>
           </w:p>
         </w:tc>
@@ -6759,7 +6759,7 @@
                 <w:sz w:val="20"/>
                 <w:szCs w:val="20"/>
               </w:rPr>
-              <w:t xml:space="preserve">  (-) Weekly      (-) Monthly     (-) Biweekly      (X) others, please specify: at every GR creation / cancellation</w:t>
+              <w:t>  (-) Weekly      (-) Monthly     (-) Biweekly      (X) others, please specify: at every GR creation / cancellation</w:t>
             </w:r>
           </w:p>
         </w:tc>
@@ -6800,7 +6800,7 @@
       </w:pPr>
       <w:bookmarkStart w:id="21" w:name="_Toc143435757"/>
       <w:r>
-        <w:t xml:space="preserve">Business logic &amp; Filtering Conditions</w:t>
+        <w:t>Business logic &amp; Filtering Conditions</w:t>
       </w:r>
       <w:bookmarkEnd w:id="21"/>
     </w:p>
@@ -6832,14 +6832,14 @@
           <w:rFonts w:cstheme="minorHAnsi"/>
           <w:lang w:eastAsia="fr-FR"/>
         </w:rPr>
-        <w:t xml:space="preserve">From iShift, t</w:t>
+        <w:t>From iShift, t</w:t>
       </w:r>
       <w:r>
         <w:rPr>
           <w:rFonts w:eastAsia="Times New Roman" w:cs="Arial"/>
           <w:color w:val="000000"/>
         </w:rPr>
-        <w:t xml:space="preserve">he GRs creation/cancellation information will be sent to eBuy Coupa (when the SAP material group is ZPRO for Promo items).</w:t>
+        <w:t>he GRs creation/cancellation information will be sent to eBuy Coupa (when the SAP material group is ZPRO for Promo items).</w:t>
       </w:r>
     </w:p>
     <w:p>
@@ -6895,7 +6895,7 @@
           <w:color w:val="000000"/>
           <w:lang w:val="en-IN"/>
         </w:rPr>
-        <w:t xml:space="preserve">In shift, an enhancement to be done to populate below values in the iDoc:</w:t>
+        <w:t>In shift, an enhancement to be done to populate below values in the iDoc:</w:t>
       </w:r>
     </w:p>
     <w:p>
@@ -6964,7 +6964,7 @@
           <w:color w:val="000000"/>
           <w:lang w:val="en-IN"/>
         </w:rPr>
-        <w:t xml:space="preserve">Message function: STM</w:t>
+        <w:t>Message function: STM</w:t>
       </w:r>
     </w:p>
     <w:p>
@@ -6986,7 +6986,7 @@
           <w:color w:val="000000"/>
           <w:lang w:val="en-IN"/>
         </w:rPr>
-        <w:t xml:space="preserve">SADR recipient: EBY</w:t>
+        <w:t>SADR recipient: EBY</w:t>
       </w:r>
     </w:p>
     <w:p>
@@ -7008,7 +7008,7 @@
           <w:color w:val="000000"/>
           <w:lang w:val="en-IN"/>
         </w:rPr>
-        <w:t xml:space="preserve">SADR sender: System client (Ex: PHS 100)</w:t>
+        <w:t>SADR sender: System client (Ex: PHS 100)</w:t>
       </w:r>
     </w:p>
     <w:p>
@@ -7042,7 +7042,7 @@
           <w:color w:val="000000"/>
           <w:lang w:val="en-IN"/>
         </w:rPr>
-        <w:t xml:space="preserve">To Action Functional Module ZPTP_AC_GR_SEGMNT_DATA from Leo should be reused, a logic to modify the Control Record Mescod (</w:t>
+        <w:t>To Action Functional Module ZPTP_AC_GR_SEGMNT_DATA from Leo should be reused, a logic to modify the Control Record Mescod (</w:t>
       </w:r>
       <w:r>
         <w:rPr>
@@ -7071,7 +7071,7 @@
           <w:color w:val="000000"/>
           <w:lang w:val="en-IN"/>
         </w:rPr>
-        <w:t xml:space="preserve">First the logic should take the PO number (</w:t>
+        <w:t>First the logic should take the PO number (</w:t>
       </w:r>
       <w:r>
         <w:rPr>
@@ -7085,7 +7085,7 @@
           <w:color w:val="000000"/>
           <w:lang w:val="en-IN"/>
         </w:rPr>
-        <w:t xml:space="preserve">) and pass it in the PO header table (EKKO-</w:t>
+        <w:t>) and pass it in the PO header table (EKKO-</w:t>
       </w:r>
       <w:r>
         <w:rPr>
@@ -7099,7 +7099,7 @@
           <w:color w:val="000000"/>
           <w:lang w:val="en-IN"/>
         </w:rPr>
-        <w:t xml:space="preserve">) to get the PO type (EKKO-</w:t>
+        <w:t>) to get the PO type (EKKO-</w:t>
       </w:r>
       <w:r>
         <w:rPr>
@@ -7119,7 +7119,7 @@
         <w:rPr>
           <w:rStyle w:val="ui-provider"/>
         </w:rPr>
-        <w:t xml:space="preserve">BSART = 'ZNBE' then make Message Variant MESCOD = 'EBY'</w:t>
+        <w:t>BSART = 'ZNBE' then make Message Variant MESCOD = 'EBY'</w:t>
       </w:r>
     </w:p>
     <w:p>
@@ -7171,7 +7171,7 @@
                     <pic:cNvPicPr/>
                   </pic:nvPicPr>
                   <pic:blipFill>
-                    <a:blip r:embed="rId17"/>
+                    <a:blip r:embed="rId19"/>
                     <a:stretch>
                       <a:fillRect/>
                     </a:stretch>
@@ -7697,7 +7697,7 @@
           <w:sz w:val="24"/>
           <w:szCs w:val="24"/>
         </w:rPr>
-        <w:t xml:space="preserve">: add Citibank reconciliation file in idoc ACCDOCUMENT04 </w:t>
+        <w:t xml:space="preserve">: add Citibank reconciliation file in idoc ACC_DOCUMENT04 </w:t>
       </w:r>
     </w:p>
     <w:p>
@@ -7749,7 +7749,7 @@
       </w:r>
       <w:bookmarkStart w:id="24" w:name="_Hlk208489439"/>
       <w:r>
-        <w:t xml:space="preserve">type &amp; iDoc type during the idoc posting in iShift:</w:t>
+        <w:t>type &amp; iDoc type during the idoc posting in iShift:</w:t>
       </w:r>
     </w:p>
     <w:p>
@@ -7765,7 +7765,7 @@
         <w:spacing w:after="0" w:line="240" w:lineRule="auto"/>
       </w:pPr>
       <w:r>
-        <w:t xml:space="preserve">Idoc type: ACC_DOCUMENT04</w:t>
+        <w:t>Idoc type: ACC_DOCUMENT04</w:t>
       </w:r>
     </w:p>
     <w:p>
@@ -7781,7 +7781,7 @@
         <w:spacing w:after="0" w:line="240" w:lineRule="auto"/>
       </w:pPr>
       <w:r>
-        <w:t xml:space="preserve">Message type: ACC_DOCUMENT</w:t>
+        <w:t>Message type: ACC_DOCUMENT</w:t>
       </w:r>
     </w:p>
     <w:p>
@@ -8280,7 +8280,7 @@
                     <pic:cNvPicPr/>
                   </pic:nvPicPr>
                   <pic:blipFill>
-                    <a:blip r:embed="rId18"/>
+                    <a:blip r:embed="rId20"/>
                     <a:stretch>
                       <a:fillRect/>
                     </a:stretch>
@@ -8347,7 +8347,7 @@
                     <pic:cNvPicPr/>
                   </pic:nvPicPr>
                   <pic:blipFill>
-                    <a:blip r:embed="rId19"/>
+                    <a:blip r:embed="rId21"/>
                     <a:stretch>
                       <a:fillRect/>
                     </a:stretch>
@@ -8439,7 +8439,7 @@
           <w:szCs w:val="24"/>
           <w:highlight w:val="yellow"/>
         </w:rPr>
-        <w:t xml:space="preserve">: add Citibank reconciliation file in idoc ACCDOCUMENT04</w:t>
+        <w:t>: add Citibank reconciliation file in idoc ACC_DOCUMENT04</w:t>
       </w:r>
       <w:r>
         <w:rPr>
@@ -8474,7 +8474,7 @@
           <w:b/>
           <w:highlight w:val="yellow"/>
         </w:rPr>
-        <w:t xml:space="preserve">BEGIN OF CHANGE-</w:t>
+        <w:t>BEGIN OF CHANGE-</w:t>
       </w:r>
       <w:r>
         <w:rPr>
@@ -8488,31 +8488,77 @@
         <w:spacing w:after="120" w:line="240" w:lineRule="auto"/>
       </w:pPr>
       <w:r>
-        <w:t xml:space="preserve">For the new interfaces IFS_P2P_143 (Citibank HRS incoming invoices) and IFS_P2P_144 (Citibank HRS reclassification document), the message type, IDoc type, message variant and sender must be maintained for the IDocs posted in iShift. The existing settings used for partner applications passing through VIM are reused (same IDoc format as the Tungsten invoices); the screenshots of the IDoc display (Typinfo, Partner, Address tabs) taken on the Tungsten example (message variant and SADR sender TUN) apply with HRS instead of TUN.</w:t>
+        <w:t xml:space="preserve">For the new interfaces IFS_P2P_143 (Citibank HRS incoming invoices) and IFS_P2P_144 (Citibank HRS reclassification document), the message type, IDoc type, message variant and sender must be maintained for the IDocs posted in iShift. The existing settings used for partner applications passing through VIM are reused (same IDoc format as the Tungsten invoices); the screenshot of the IDoc display taken on the Tungsten example (message variant and SADR sender TUN) applies with HRS instead of TUN.</w:t>
       </w:r>
     </w:p>
     <w:p>
       <w:pPr>
-        <w:keepNext/>
-        <w:spacing w:after="60" w:line="240" w:lineRule="auto"/>
+        <w:spacing w:after="120" w:line="240" w:lineRule="auto"/>
       </w:pPr>
       <w:r>
         <w:rPr>
-          <w:b/>
-        </w:rPr>
-        <w:t xml:space="preserve">1. IFS_P2P_143 – Citibank HRS incoming invoices</w:t>
+          <w:noProof/>
+        </w:rPr>
+        <w:lastRenderedPageBreak/>
+        <w:drawing>
+          <wp:inline distT="0" distB="0" distL="0" distR="0" wp14:anchorId="1DFEA3C3" wp14:editId="43DBB1DA">
+            <wp:extent cx="3422200" cy="2581275"/>
+            <wp:effectExtent l="0" t="0" r="6985" b="0"/>
+            <wp:docPr id="1406152005" name="Image 1"/>
+            <wp:cNvGraphicFramePr>
+              <a:graphicFrameLocks xmlns:a="http://schemas.openxmlformats.org/drawingml/2006/main" noChangeAspect="1"/>
+            </wp:cNvGraphicFramePr>
+            <a:graphic xmlns:a="http://schemas.openxmlformats.org/drawingml/2006/main">
+              <a:graphicData uri="http://schemas.openxmlformats.org/drawingml/2006/picture">
+                <pic:pic xmlns:pic="http://schemas.openxmlformats.org/drawingml/2006/picture">
+                  <pic:nvPicPr>
+                    <pic:cNvPr id="1406152005" name=""/>
+                    <pic:cNvPicPr/>
+                  </pic:nvPicPr>
+                  <pic:blipFill>
+                    <a:blip r:embed="rId22"/>
+                    <a:stretch>
+                      <a:fillRect/>
+                    </a:stretch>
+                  </pic:blipFill>
+                  <pic:spPr>
+                    <a:xfrm>
+                      <a:off x="0" y="0"/>
+                      <a:ext cx="3424554" cy="2583050"/>
+                    </a:xfrm>
+                    <a:prstGeom prst="rect">
+                      <a:avLst/>
+                    </a:prstGeom>
+                  </pic:spPr>
+                </pic:pic>
+              </a:graphicData>
+            </a:graphic>
+          </wp:inline>
+        </w:drawing>
       </w:r>
     </w:p>
     <w:p>
       <w:pPr>
         <w:keepNext/>
+        <w:spacing w:after="60" w:line="240" w:lineRule="auto"/>
+      </w:pPr>
+      <w:r>
+        <w:rPr>
+          <w:b/>
+        </w:rPr>
+        <w:t>1. IFS_P2P_143 – Citibank HRS incoming invoices</w:t>
+      </w:r>
+    </w:p>
+    <w:p>
+      <w:pPr>
+        <w:keepNext/>
         <w:spacing w:after="40" w:line="240" w:lineRule="auto"/>
       </w:pPr>
       <w:r>
         <w:rPr>
           <w:b/>
         </w:rPr>
-        <w:t xml:space="preserve">Typinfo tab</w:t>
+        <w:t>Typinfo tab</w:t>
       </w:r>
     </w:p>
     <w:tbl>
@@ -8558,7 +8604,7 @@
                 <w:sz w:val="18"/>
                 <w:szCs w:val="18"/>
               </w:rPr>
-              <w:t xml:space="preserve">Field</w:t>
+              <w:t>Field</w:t>
             </w:r>
           </w:p>
         </w:tc>
@@ -8577,7 +8623,7 @@
                 <w:sz w:val="18"/>
                 <w:szCs w:val="18"/>
               </w:rPr>
-              <w:t xml:space="preserve">Value</w:t>
+              <w:t>Value</w:t>
             </w:r>
           </w:p>
         </w:tc>
@@ -8596,7 +8642,7 @@
                 <w:sz w:val="18"/>
                 <w:szCs w:val="18"/>
               </w:rPr>
-              <w:t xml:space="preserve">Comment</w:t>
+              <w:t>Comment</w:t>
             </w:r>
           </w:p>
         </w:tc>
@@ -8619,7 +8665,7 @@
                 <w:sz w:val="18"/>
                 <w:szCs w:val="18"/>
               </w:rPr>
-              <w:t xml:space="preserve">Direction</w:t>
+              <w:t>Direction</w:t>
             </w:r>
           </w:p>
         </w:tc>
@@ -8636,7 +8682,7 @@
                 <w:sz w:val="18"/>
                 <w:szCs w:val="18"/>
               </w:rPr>
-              <w:t xml:space="preserve">2 – Inbound</w:t>
+              <w:t>2 – Inbound</w:t>
             </w:r>
           </w:p>
         </w:tc>
@@ -8669,7 +8715,7 @@
                 <w:sz w:val="18"/>
                 <w:szCs w:val="18"/>
               </w:rPr>
-              <w:t xml:space="preserve">Basic type</w:t>
+              <w:t>Basic type</w:t>
             </w:r>
           </w:p>
         </w:tc>
@@ -8686,7 +8732,7 @@
                 <w:sz w:val="18"/>
                 <w:szCs w:val="18"/>
               </w:rPr>
-              <w:t xml:space="preserve">INVOIC02</w:t>
+              <w:t>INVOIC02</w:t>
             </w:r>
           </w:p>
         </w:tc>
@@ -8703,7 +8749,7 @@
                 <w:sz w:val="18"/>
                 <w:szCs w:val="18"/>
               </w:rPr>
-              <w:t xml:space="preserve">Invoice/Billing document</w:t>
+              <w:t>Invoice/Billing document</w:t>
             </w:r>
           </w:p>
         </w:tc>
@@ -8726,7 +8772,7 @@
                 <w:sz w:val="18"/>
                 <w:szCs w:val="18"/>
               </w:rPr>
-              <w:t xml:space="preserve">Extension</w:t>
+              <w:t>Extension</w:t>
             </w:r>
           </w:p>
         </w:tc>
@@ -8743,7 +8789,7 @@
                 <w:sz w:val="18"/>
                 <w:szCs w:val="18"/>
               </w:rPr>
-              <w:t xml:space="preserve">ZINVOIC02_EXT</w:t>
+              <w:t>ZINVOIC02_EXT</w:t>
             </w:r>
           </w:p>
         </w:tc>
@@ -8760,7 +8806,7 @@
                 <w:sz w:val="18"/>
                 <w:szCs w:val="18"/>
               </w:rPr>
-              <w:t xml:space="preserve">Invoice/Billing document – Extension</w:t>
+              <w:t>Invoice/Billing document – Extension</w:t>
             </w:r>
           </w:p>
         </w:tc>
@@ -8783,7 +8829,7 @@
                 <w:sz w:val="18"/>
                 <w:szCs w:val="18"/>
               </w:rPr>
-              <w:t xml:space="preserve">IDoc Type</w:t>
+              <w:t>IDoc Type</w:t>
             </w:r>
           </w:p>
         </w:tc>
@@ -8800,7 +8846,7 @@
                 <w:sz w:val="18"/>
                 <w:szCs w:val="18"/>
               </w:rPr>
-              <w:t xml:space="preserve">Empty</w:t>
+              <w:t>Empty</w:t>
             </w:r>
           </w:p>
         </w:tc>
@@ -8833,7 +8879,7 @@
                 <w:sz w:val="18"/>
                 <w:szCs w:val="18"/>
               </w:rPr>
-              <w:t xml:space="preserve">Message Type</w:t>
+              <w:t>Message Type</w:t>
             </w:r>
           </w:p>
         </w:tc>
@@ -8850,7 +8896,7 @@
                 <w:sz w:val="18"/>
                 <w:szCs w:val="18"/>
               </w:rPr>
-              <w:t xml:space="preserve">INVOIC</w:t>
+              <w:t>INVOIC</w:t>
             </w:r>
           </w:p>
         </w:tc>
@@ -8867,7 +8913,7 @@
                 <w:sz w:val="18"/>
                 <w:szCs w:val="18"/>
               </w:rPr>
-              <w:t xml:space="preserve">Invoice/Billing Document</w:t>
+              <w:t>Invoice/Billing Document</w:t>
             </w:r>
           </w:p>
         </w:tc>
@@ -8890,7 +8936,7 @@
                 <w:sz w:val="18"/>
                 <w:szCs w:val="18"/>
               </w:rPr>
-              <w:t xml:space="preserve">Message Variant</w:t>
+              <w:t>Message Variant</w:t>
             </w:r>
           </w:p>
         </w:tc>
@@ -8907,7 +8953,7 @@
                 <w:sz w:val="18"/>
                 <w:szCs w:val="18"/>
               </w:rPr>
-              <w:t xml:space="preserve">HRS</w:t>
+              <w:t>HRS</w:t>
             </w:r>
           </w:p>
         </w:tc>
@@ -8924,116 +8970,23 @@
                 <w:sz w:val="18"/>
                 <w:szCs w:val="18"/>
               </w:rPr>
-              <w:t xml:space="preserve">Tungsten example: TUN</w:t>
-            </w:r>
-          </w:p>
-        </w:tc>
-      </w:tr>
-      <w:tr>
-        <w:trPr>
-          <w:cantSplit/>
-        </w:trPr>
-        <w:tc>
-          <w:tcPr>
-            <w:tcW w:w="3000" w:type="dxa"/>
-          </w:tcPr>
-          <w:p>
-            <w:pPr>
-              <w:spacing w:after="20" w:line="240" w:lineRule="auto"/>
-            </w:pPr>
-            <w:r>
-              <w:rPr>
-                <w:b/>
-                <w:sz w:val="18"/>
-                <w:szCs w:val="18"/>
-              </w:rPr>
-              <w:t xml:space="preserve">Message function</w:t>
-            </w:r>
-          </w:p>
-        </w:tc>
-        <w:tc>
-          <w:tcPr>
-            <w:tcW w:w="2600" w:type="dxa"/>
-          </w:tcPr>
-          <w:p>
-            <w:pPr>
-              <w:spacing w:after="20" w:line="240" w:lineRule="auto"/>
-            </w:pPr>
-            <w:r>
-              <w:rPr>
-                <w:sz w:val="18"/>
-                <w:szCs w:val="18"/>
-              </w:rPr>
-              <w:t xml:space="preserve">Empty</w:t>
-            </w:r>
-          </w:p>
-        </w:tc>
-        <w:tc>
-          <w:tcPr>
-            <w:tcW w:w="3760" w:type="dxa"/>
-          </w:tcPr>
-          <w:p>
-            <w:pPr>
-              <w:spacing w:after="20" w:line="240" w:lineRule="auto"/>
-            </w:pPr>
-          </w:p>
-        </w:tc>
-      </w:tr>
-      <w:tr>
-        <w:trPr>
-          <w:cantSplit/>
-        </w:trPr>
-        <w:tc>
-          <w:tcPr>
-            <w:tcW w:w="3000" w:type="dxa"/>
-          </w:tcPr>
-          <w:p>
-            <w:pPr>
-              <w:spacing w:after="20" w:line="240" w:lineRule="auto"/>
-            </w:pPr>
-            <w:r>
-              <w:rPr>
-                <w:b/>
-                <w:sz w:val="18"/>
-                <w:szCs w:val="18"/>
-              </w:rPr>
-              <w:t xml:space="preserve">Test Flag</w:t>
-            </w:r>
-          </w:p>
-        </w:tc>
-        <w:tc>
-          <w:tcPr>
-            <w:tcW w:w="2600" w:type="dxa"/>
-          </w:tcPr>
-          <w:p>
-            <w:pPr>
-              <w:spacing w:after="20" w:line="240" w:lineRule="auto"/>
-            </w:pPr>
-            <w:r>
-              <w:rPr>
-                <w:sz w:val="18"/>
-                <w:szCs w:val="18"/>
-              </w:rPr>
-              <w:t xml:space="preserve">Not set</w:t>
-            </w:r>
-          </w:p>
-        </w:tc>
-        <w:tc>
-          <w:tcPr>
-            <w:tcW w:w="3760" w:type="dxa"/>
-          </w:tcPr>
-          <w:p>
-            <w:pPr>
-              <w:spacing w:after="20" w:line="240" w:lineRule="auto"/>
-            </w:pPr>
+              <w:t>Tungsten example: TUN</w:t>
+            </w:r>
           </w:p>
         </w:tc>
       </w:tr>
     </w:tbl>
     <w:p>
       <w:pPr>
-        <w:spacing w:after="60" w:line="240" w:lineRule="auto"/>
-      </w:pPr>
+        <w:keepNext/>
+        <w:spacing w:after="40" w:line="240" w:lineRule="auto"/>
+      </w:pPr>
+      <w:r>
+        <w:rPr>
+          <w:b/>
+        </w:rPr>
+        <w:t xml:space="preserve"/>
+      </w:r>
     </w:p>
     <w:p>
       <w:pPr>
@@ -9044,7 +8997,7 @@
         <w:rPr>
           <w:b/>
         </w:rPr>
-        <w:t xml:space="preserve">Partner tab</w:t>
+        <w:t xml:space="preserve">Partner and Address tabs</w:t>
       </w:r>
     </w:p>
     <w:tbl>
@@ -9090,7 +9043,7 @@
                 <w:sz w:val="18"/>
                 <w:szCs w:val="18"/>
               </w:rPr>
-              <w:t xml:space="preserve">Field</w:t>
+              <w:t>Field</w:t>
             </w:r>
           </w:p>
         </w:tc>
@@ -9109,7 +9062,7 @@
                 <w:sz w:val="18"/>
                 <w:szCs w:val="18"/>
               </w:rPr>
-              <w:t xml:space="preserve">Value</w:t>
+              <w:t>Value</w:t>
             </w:r>
           </w:p>
         </w:tc>
@@ -9128,7 +9081,7 @@
                 <w:sz w:val="18"/>
                 <w:szCs w:val="18"/>
               </w:rPr>
-              <w:t xml:space="preserve">Comment</w:t>
+              <w:t>Comment</w:t>
             </w:r>
           </w:p>
         </w:tc>
@@ -9151,7 +9104,7 @@
                 <w:sz w:val="18"/>
                 <w:szCs w:val="18"/>
               </w:rPr>
-              <w:t xml:space="preserve">Recipient – Port</w:t>
+              <w:t xml:space="preserve">Partner – Sender (port, partner number)</w:t>
             </w:r>
           </w:p>
         </w:tc>
@@ -9168,7 +9121,7 @@
                 <w:sz w:val="18"/>
                 <w:szCs w:val="18"/>
               </w:rPr>
-              <w:t xml:space="preserve">iShift receiving port</w:t>
+              <w:t xml:space="preserve">TIBCO port and logical system (partner type LS, role LS)</w:t>
             </w:r>
           </w:p>
         </w:tc>
@@ -9181,11 +9134,7 @@
               <w:spacing w:after="20" w:line="240" w:lineRule="auto"/>
             </w:pPr>
             <w:r>
-              <w:rPr>
-                <w:sz w:val="18"/>
-                <w:szCs w:val="18"/>
-              </w:rPr>
-              <w:t xml:space="preserve">Tungsten example: SAPUHV (file port); value of the target iShift system</w:t>
+              <w:t xml:space="preserve">Tungsten example: UTIBGBO / UTIBGBO_T1 – TBC with the TIBCO team</w:t>
             </w:r>
           </w:p>
         </w:tc>
@@ -9208,7 +9157,7 @@
                 <w:sz w:val="18"/>
                 <w:szCs w:val="18"/>
               </w:rPr>
-              <w:t xml:space="preserve">Recipient – Partner number</w:t>
+              <w:t xml:space="preserve">Partner – Recipient (port, partner number)</w:t>
             </w:r>
           </w:p>
         </w:tc>
@@ -9225,7 +9174,7 @@
                 <w:sz w:val="18"/>
                 <w:szCs w:val="18"/>
               </w:rPr>
-              <w:t xml:space="preserve">iShift logical system of the client</w:t>
+              <w:t xml:space="preserve">iShift port and logical system of the client (partner type LS)</w:t>
             </w:r>
           </w:p>
         </w:tc>
@@ -9238,11 +9187,7 @@
               <w:spacing w:after="20" w:line="240" w:lineRule="auto"/>
             </w:pPr>
             <w:r>
-              <w:rPr>
-                <w:sz w:val="18"/>
-                <w:szCs w:val="18"/>
-              </w:rPr>
-              <w:t xml:space="preserve">Tungsten example: UHVCLNT100</w:t>
+              <w:t xml:space="preserve">Tungsten example: SAPUHV / UHVCLNT100</w:t>
             </w:r>
           </w:p>
         </w:tc>
@@ -9265,7 +9210,7 @@
                 <w:sz w:val="18"/>
                 <w:szCs w:val="18"/>
               </w:rPr>
-              <w:t xml:space="preserve">Recipient – Part. type</w:t>
+              <w:t xml:space="preserve">Address – SADR sender (SNDSAD)</w:t>
             </w:r>
           </w:p>
         </w:tc>
@@ -9282,7 +9227,7 @@
                 <w:sz w:val="18"/>
                 <w:szCs w:val="18"/>
               </w:rPr>
-              <w:t xml:space="preserve">LS</w:t>
+              <w:t xml:space="preserve">HRS</w:t>
             </w:r>
           </w:p>
         </w:tc>
@@ -9295,289 +9240,7 @@
               <w:spacing w:after="20" w:line="240" w:lineRule="auto"/>
             </w:pPr>
             <w:r>
-              <w:rPr>
-                <w:sz w:val="18"/>
-                <w:szCs w:val="18"/>
-              </w:rPr>
-              <w:t xml:space="preserve">Logical system</w:t>
-            </w:r>
-          </w:p>
-        </w:tc>
-      </w:tr>
-      <w:tr>
-        <w:trPr>
-          <w:cantSplit/>
-        </w:trPr>
-        <w:tc>
-          <w:tcPr>
-            <w:tcW w:w="3000" w:type="dxa"/>
-          </w:tcPr>
-          <w:p>
-            <w:pPr>
-              <w:spacing w:after="20" w:line="240" w:lineRule="auto"/>
-            </w:pPr>
-            <w:r>
-              <w:rPr>
-                <w:b/>
-                <w:sz w:val="18"/>
-                <w:szCs w:val="18"/>
-              </w:rPr>
-              <w:t xml:space="preserve">Recipient – Function</w:t>
-            </w:r>
-          </w:p>
-        </w:tc>
-        <w:tc>
-          <w:tcPr>
-            <w:tcW w:w="2600" w:type="dxa"/>
-          </w:tcPr>
-          <w:p>
-            <w:pPr>
-              <w:spacing w:after="20" w:line="240" w:lineRule="auto"/>
-            </w:pPr>
-            <w:r>
-              <w:rPr>
-                <w:sz w:val="18"/>
-                <w:szCs w:val="18"/>
-              </w:rPr>
-              <w:t xml:space="preserve">Empty</w:t>
-            </w:r>
-          </w:p>
-        </w:tc>
-        <w:tc>
-          <w:tcPr>
-            <w:tcW w:w="3760" w:type="dxa"/>
-          </w:tcPr>
-          <w:p>
-            <w:pPr>
-              <w:spacing w:after="20" w:line="240" w:lineRule="auto"/>
-            </w:pPr>
-          </w:p>
-        </w:tc>
-      </w:tr>
-      <w:tr>
-        <w:trPr>
-          <w:cantSplit/>
-        </w:trPr>
-        <w:tc>
-          <w:tcPr>
-            <w:tcW w:w="3000" w:type="dxa"/>
-          </w:tcPr>
-          <w:p>
-            <w:pPr>
-              <w:spacing w:after="20" w:line="240" w:lineRule="auto"/>
-            </w:pPr>
-            <w:r>
-              <w:rPr>
-                <w:b/>
-                <w:sz w:val="18"/>
-                <w:szCs w:val="18"/>
-              </w:rPr>
-              <w:t xml:space="preserve">Sender – Port</w:t>
-            </w:r>
-          </w:p>
-        </w:tc>
-        <w:tc>
-          <w:tcPr>
-            <w:tcW w:w="2600" w:type="dxa"/>
-          </w:tcPr>
-          <w:p>
-            <w:pPr>
-              <w:spacing w:after="20" w:line="240" w:lineRule="auto"/>
-            </w:pPr>
-            <w:r>
-              <w:rPr>
-                <w:sz w:val="18"/>
-                <w:szCs w:val="18"/>
-              </w:rPr>
-              <w:t xml:space="preserve">TIBCO sender port</w:t>
-            </w:r>
-          </w:p>
-        </w:tc>
-        <w:tc>
-          <w:tcPr>
-            <w:tcW w:w="3760" w:type="dxa"/>
-          </w:tcPr>
-          <w:p>
-            <w:pPr>
-              <w:spacing w:after="20" w:line="240" w:lineRule="auto"/>
-            </w:pPr>
-            <w:r>
-              <w:rPr>
-                <w:sz w:val="18"/>
-                <w:szCs w:val="18"/>
-              </w:rPr>
-              <w:t xml:space="preserve">Tungsten example: UTIBGBO – TBC with the TIBCO team</w:t>
-            </w:r>
-          </w:p>
-        </w:tc>
-      </w:tr>
-      <w:tr>
-        <w:trPr>
-          <w:cantSplit/>
-        </w:trPr>
-        <w:tc>
-          <w:tcPr>
-            <w:tcW w:w="3000" w:type="dxa"/>
-          </w:tcPr>
-          <w:p>
-            <w:pPr>
-              <w:spacing w:after="20" w:line="240" w:lineRule="auto"/>
-            </w:pPr>
-            <w:r>
-              <w:rPr>
-                <w:b/>
-                <w:sz w:val="18"/>
-                <w:szCs w:val="18"/>
-              </w:rPr>
-              <w:t xml:space="preserve">Sender – Partner number</w:t>
-            </w:r>
-          </w:p>
-        </w:tc>
-        <w:tc>
-          <w:tcPr>
-            <w:tcW w:w="2600" w:type="dxa"/>
-          </w:tcPr>
-          <w:p>
-            <w:pPr>
-              <w:spacing w:after="20" w:line="240" w:lineRule="auto"/>
-            </w:pPr>
-            <w:r>
-              <w:rPr>
-                <w:sz w:val="18"/>
-                <w:szCs w:val="18"/>
-              </w:rPr>
-              <w:t xml:space="preserve">TIBCO logical system</w:t>
-            </w:r>
-          </w:p>
-        </w:tc>
-        <w:tc>
-          <w:tcPr>
-            <w:tcW w:w="3760" w:type="dxa"/>
-          </w:tcPr>
-          <w:p>
-            <w:pPr>
-              <w:spacing w:after="20" w:line="240" w:lineRule="auto"/>
-            </w:pPr>
-            <w:r>
-              <w:rPr>
-                <w:sz w:val="18"/>
-                <w:szCs w:val="18"/>
-              </w:rPr>
-              <w:t xml:space="preserve">Tungsten example: UTIBGBO_T1 – TBC with the TIBCO team</w:t>
-            </w:r>
-          </w:p>
-        </w:tc>
-      </w:tr>
-      <w:tr>
-        <w:trPr>
-          <w:cantSplit/>
-        </w:trPr>
-        <w:tc>
-          <w:tcPr>
-            <w:tcW w:w="3000" w:type="dxa"/>
-          </w:tcPr>
-          <w:p>
-            <w:pPr>
-              <w:spacing w:after="20" w:line="240" w:lineRule="auto"/>
-            </w:pPr>
-            <w:r>
-              <w:rPr>
-                <w:b/>
-                <w:sz w:val="18"/>
-                <w:szCs w:val="18"/>
-              </w:rPr>
-              <w:t xml:space="preserve">Sender – Partn. type</w:t>
-            </w:r>
-          </w:p>
-        </w:tc>
-        <w:tc>
-          <w:tcPr>
-            <w:tcW w:w="2600" w:type="dxa"/>
-          </w:tcPr>
-          <w:p>
-            <w:pPr>
-              <w:spacing w:after="20" w:line="240" w:lineRule="auto"/>
-            </w:pPr>
-            <w:r>
-              <w:rPr>
-                <w:sz w:val="18"/>
-                <w:szCs w:val="18"/>
-              </w:rPr>
-              <w:t xml:space="preserve">LS</w:t>
-            </w:r>
-          </w:p>
-        </w:tc>
-        <w:tc>
-          <w:tcPr>
-            <w:tcW w:w="3760" w:type="dxa"/>
-          </w:tcPr>
-          <w:p>
-            <w:pPr>
-              <w:spacing w:after="20" w:line="240" w:lineRule="auto"/>
-            </w:pPr>
-            <w:r>
-              <w:rPr>
-                <w:sz w:val="18"/>
-                <w:szCs w:val="18"/>
-              </w:rPr>
-              <w:t xml:space="preserve">Logical system</w:t>
-            </w:r>
-          </w:p>
-        </w:tc>
-      </w:tr>
-      <w:tr>
-        <w:trPr>
-          <w:cantSplit/>
-        </w:trPr>
-        <w:tc>
-          <w:tcPr>
-            <w:tcW w:w="3000" w:type="dxa"/>
-          </w:tcPr>
-          <w:p>
-            <w:pPr>
-              <w:spacing w:after="20" w:line="240" w:lineRule="auto"/>
-            </w:pPr>
-            <w:r>
-              <w:rPr>
-                <w:b/>
-                <w:sz w:val="18"/>
-                <w:szCs w:val="18"/>
-              </w:rPr>
-              <w:t xml:space="preserve">Sender – Partner role</w:t>
-            </w:r>
-          </w:p>
-        </w:tc>
-        <w:tc>
-          <w:tcPr>
-            <w:tcW w:w="2600" w:type="dxa"/>
-          </w:tcPr>
-          <w:p>
-            <w:pPr>
-              <w:spacing w:after="20" w:line="240" w:lineRule="auto"/>
-            </w:pPr>
-            <w:r>
-              <w:rPr>
-                <w:sz w:val="18"/>
-                <w:szCs w:val="18"/>
-              </w:rPr>
-              <w:t xml:space="preserve">LS</w:t>
-            </w:r>
-          </w:p>
-        </w:tc>
-        <w:tc>
-          <w:tcPr>
-            <w:tcW w:w="3760" w:type="dxa"/>
-          </w:tcPr>
-          <w:p>
-            <w:pPr>
-              <w:spacing w:after="20" w:line="240" w:lineRule="auto"/>
-            </w:pPr>
-            <w:r>
-              <w:rPr>
-                <w:sz w:val="18"/>
-                <w:szCs w:val="18"/>
-              </w:rPr>
-              <w:t xml:space="preserve">Logical system</w:t>
+              <w:t xml:space="preserve">Tungsten example: TUN</w:t>
             </w:r>
           </w:p>
         </w:tc>
@@ -9591,13 +9254,17 @@
     <w:p>
       <w:pPr>
         <w:keepNext/>
-        <w:spacing w:after="40" w:line="240" w:lineRule="auto"/>
+        <w:spacing w:after="60" w:line="240" w:lineRule="auto"/>
+        <w:rPr>
+          <w:lang w:val="fr-FR"/>
+        </w:rPr>
       </w:pPr>
       <w:r>
         <w:rPr>
           <w:b/>
-        </w:rPr>
-        <w:t xml:space="preserve">Address tab</w:t>
+          <w:lang w:val="fr-FR"/>
+        </w:rPr>
+        <w:t>2. IFS_P2P_144 – Citibank HRS reclassification document</w:t>
       </w:r>
     </w:p>
     <w:tbl>
@@ -9662,7 +9329,7 @@
                 <w:sz w:val="18"/>
                 <w:szCs w:val="18"/>
               </w:rPr>
-              <w:t xml:space="preserve">Value</w:t>
+              <w:t>Value</w:t>
             </w:r>
           </w:p>
         </w:tc>
@@ -9681,7 +9348,7 @@
                 <w:sz w:val="18"/>
                 <w:szCs w:val="18"/>
               </w:rPr>
-              <w:t xml:space="preserve">Comment</w:t>
+              <w:t>Comment</w:t>
             </w:r>
           </w:p>
         </w:tc>
@@ -9704,7 +9371,7 @@
                 <w:sz w:val="18"/>
                 <w:szCs w:val="18"/>
               </w:rPr>
-              <w:t xml:space="preserve">Logical addresses – Recipient / Log.addr.</w:t>
+              <w:t>Direction</w:t>
             </w:r>
           </w:p>
         </w:tc>
@@ -9721,7 +9388,7 @@
                 <w:sz w:val="18"/>
                 <w:szCs w:val="18"/>
               </w:rPr>
-              <w:t xml:space="preserve">Empty</w:t>
+              <w:t>2 – Inbound</w:t>
             </w:r>
           </w:p>
         </w:tc>
@@ -9754,7 +9421,7 @@
                 <w:sz w:val="18"/>
                 <w:szCs w:val="18"/>
               </w:rPr>
-              <w:t xml:space="preserve">SADR addresses – Recipients</w:t>
+              <w:t>Basic type</w:t>
             </w:r>
           </w:p>
         </w:tc>
@@ -9771,7 +9438,7 @@
                 <w:sz w:val="18"/>
                 <w:szCs w:val="18"/>
               </w:rPr>
-              <w:t xml:space="preserve">Empty</w:t>
+              <w:t>ACC_DOCUMENT04</w:t>
             </w:r>
           </w:p>
         </w:tc>
@@ -9804,7 +9471,7 @@
                 <w:sz w:val="18"/>
                 <w:szCs w:val="18"/>
               </w:rPr>
-              <w:t xml:space="preserve">SADR addresses – Sender (SNDSAD)</w:t>
+              <w:t>Extension</w:t>
             </w:r>
           </w:p>
         </w:tc>
@@ -9821,7 +9488,7 @@
                 <w:sz w:val="18"/>
                 <w:szCs w:val="18"/>
               </w:rPr>
-              <w:t xml:space="preserve">HRS</w:t>
+              <w:t>Empty</w:t>
             </w:r>
           </w:p>
         </w:tc>
@@ -9838,119 +9505,7 @@
                 <w:sz w:val="18"/>
                 <w:szCs w:val="18"/>
               </w:rPr>
-              <w:t xml:space="preserve">Tungsten example: TUN</w:t>
-            </w:r>
-          </w:p>
-        </w:tc>
-      </w:tr>
-    </w:tbl>
-    <w:p>
-      <w:pPr>
-        <w:spacing w:after="60" w:line="240" w:lineRule="auto"/>
-      </w:pPr>
-    </w:p>
-    <w:p>
-      <w:pPr>
-        <w:spacing w:after="120" w:line="240" w:lineRule="auto"/>
-      </w:pPr>
-      <w:r>
-        <w:t xml:space="preserve">The new message variant HRS (MESCOD) and the new sender SADR HRS (SNDSAD) must be accepted for the INVOIC message type in the inbound partner profile, so that the IDoc is processed like the other partner invoices passing through SAP VIM.</w:t>
-      </w:r>
-    </w:p>
-    <w:p>
-      <w:pPr>
-        <w:keepNext/>
-        <w:spacing w:after="60" w:line="240" w:lineRule="auto"/>
-      </w:pPr>
-      <w:r>
-        <w:rPr>
-          <w:b/>
-        </w:rPr>
-        <w:t xml:space="preserve">2. IFS_P2P_144 – Citibank HRS reclassification document</w:t>
-      </w:r>
-    </w:p>
-    <w:tbl>
-      <w:tblPr>
-        <w:tblW w:w="9360" w:type="dxa"/>
-        <w:tblBorders>
-          <w:top w:val="single" w:sz="4" w:space="0" w:color="auto"/>
-          <w:left w:val="single" w:sz="4" w:space="0" w:color="auto"/>
-          <w:bottom w:val="single" w:sz="4" w:space="0" w:color="auto"/>
-          <w:right w:val="single" w:sz="4" w:space="0" w:color="auto"/>
-          <w:insideH w:val="single" w:sz="4" w:space="0" w:color="auto"/>
-          <w:insideV w:val="single" w:sz="4" w:space="0" w:color="auto"/>
-        </w:tblBorders>
-        <w:tblLayout w:type="fixed"/>
-        <w:tblCellMar>
-          <w:left w:w="70" w:type="dxa"/>
-          <w:right w:w="70" w:type="dxa"/>
-        </w:tblCellMar>
-        <w:tblLook w:val="04A0" w:firstRow="1" w:lastRow="0" w:firstColumn="1" w:lastColumn="0" w:noHBand="0" w:noVBand="1"/>
-      </w:tblPr>
-      <w:tblGrid>
-        <w:gridCol w:w="3000"/>
-        <w:gridCol w:w="2600"/>
-        <w:gridCol w:w="3760"/>
-      </w:tblGrid>
-      <w:tr>
-        <w:trPr>
-          <w:cantSplit/>
-          <w:tblHeader/>
-        </w:trPr>
-        <w:tc>
-          <w:tcPr>
-            <w:tcW w:w="3000" w:type="dxa"/>
-            <w:shd w:val="clear" w:color="auto" w:fill="D9D9D9"/>
-          </w:tcPr>
-          <w:p>
-            <w:pPr>
-              <w:spacing w:after="20" w:line="240" w:lineRule="auto"/>
-            </w:pPr>
-            <w:r>
-              <w:rPr>
-                <w:b/>
-                <w:sz w:val="18"/>
-                <w:szCs w:val="18"/>
-              </w:rPr>
-              <w:t xml:space="preserve">Typinfo / Address field</w:t>
-            </w:r>
-          </w:p>
-        </w:tc>
-        <w:tc>
-          <w:tcPr>
-            <w:tcW w:w="2600" w:type="dxa"/>
-            <w:shd w:val="clear" w:color="auto" w:fill="D9D9D9"/>
-          </w:tcPr>
-          <w:p>
-            <w:pPr>
-              <w:spacing w:after="20" w:line="240" w:lineRule="auto"/>
-            </w:pPr>
-            <w:r>
-              <w:rPr>
-                <w:b/>
-                <w:sz w:val="18"/>
-                <w:szCs w:val="18"/>
-              </w:rPr>
-              <w:t xml:space="preserve">Value</w:t>
-            </w:r>
-          </w:p>
-        </w:tc>
-        <w:tc>
-          <w:tcPr>
-            <w:tcW w:w="3760" w:type="dxa"/>
-            <w:shd w:val="clear" w:color="auto" w:fill="D9D9D9"/>
-          </w:tcPr>
-          <w:p>
-            <w:pPr>
-              <w:spacing w:after="20" w:line="240" w:lineRule="auto"/>
-            </w:pPr>
-            <w:r>
-              <w:rPr>
-                <w:b/>
-                <w:sz w:val="18"/>
-                <w:szCs w:val="18"/>
-              </w:rPr>
-              <w:t xml:space="preserve">Comment</w:t>
+              <w:t xml:space="preserve">Standard basic type, no extension (see IFS_P2P_144)</w:t>
             </w:r>
           </w:p>
         </w:tc>
@@ -9973,7 +9528,7 @@
                 <w:sz w:val="18"/>
                 <w:szCs w:val="18"/>
               </w:rPr>
-              <w:t xml:space="preserve">Direction</w:t>
+              <w:t>Message Type</w:t>
             </w:r>
           </w:p>
         </w:tc>
@@ -9990,7 +9545,7 @@
                 <w:sz w:val="18"/>
                 <w:szCs w:val="18"/>
               </w:rPr>
-              <w:t xml:space="preserve">2 – Inbound</w:t>
+              <w:t>ACC_DOCUMENT</w:t>
             </w:r>
           </w:p>
         </w:tc>
@@ -10023,7 +9578,7 @@
                 <w:sz w:val="18"/>
                 <w:szCs w:val="18"/>
               </w:rPr>
-              <w:t xml:space="preserve">Basic type</w:t>
+              <w:t>Message Variant</w:t>
             </w:r>
           </w:p>
         </w:tc>
@@ -10040,7 +9595,7 @@
                 <w:sz w:val="18"/>
                 <w:szCs w:val="18"/>
               </w:rPr>
-              <w:t xml:space="preserve">ACC_DOCUMENT04</w:t>
+              <w:t>HRS</w:t>
             </w:r>
           </w:p>
         </w:tc>
@@ -10073,7 +9628,7 @@
                 <w:sz w:val="18"/>
                 <w:szCs w:val="18"/>
               </w:rPr>
-              <w:t xml:space="preserve">Extension</w:t>
+              <w:t xml:space="preserve">SADR sender (SNDSAD)</w:t>
             </w:r>
           </w:p>
         </w:tc>
@@ -10090,7 +9645,7 @@
                 <w:sz w:val="18"/>
                 <w:szCs w:val="18"/>
               </w:rPr>
-              <w:t xml:space="preserve">Empty</w:t>
+              <w:t xml:space="preserve">HRS</w:t>
             </w:r>
           </w:p>
         </w:tc>
@@ -10103,218 +9658,7 @@
               <w:spacing w:after="20" w:line="240" w:lineRule="auto"/>
             </w:pPr>
             <w:r>
-              <w:rPr>
-                <w:sz w:val="18"/>
-                <w:szCs w:val="18"/>
-              </w:rPr>
-              <w:t xml:space="preserve">No extension identified – TBC with IFS_P2P_144</w:t>
-            </w:r>
-          </w:p>
-        </w:tc>
-      </w:tr>
-      <w:tr>
-        <w:trPr>
-          <w:cantSplit/>
-        </w:trPr>
-        <w:tc>
-          <w:tcPr>
-            <w:tcW w:w="3000" w:type="dxa"/>
-          </w:tcPr>
-          <w:p>
-            <w:pPr>
-              <w:spacing w:after="20" w:line="240" w:lineRule="auto"/>
-            </w:pPr>
-            <w:r>
-              <w:rPr>
-                <w:b/>
-                <w:sz w:val="18"/>
-                <w:szCs w:val="18"/>
-              </w:rPr>
-              <w:t xml:space="preserve">Message Type</w:t>
-            </w:r>
-          </w:p>
-        </w:tc>
-        <w:tc>
-          <w:tcPr>
-            <w:tcW w:w="2600" w:type="dxa"/>
-          </w:tcPr>
-          <w:p>
-            <w:pPr>
-              <w:spacing w:after="20" w:line="240" w:lineRule="auto"/>
-            </w:pPr>
-            <w:r>
-              <w:rPr>
-                <w:sz w:val="18"/>
-                <w:szCs w:val="18"/>
-              </w:rPr>
-              <w:t xml:space="preserve">ACC_DOCUMENT</w:t>
-            </w:r>
-          </w:p>
-        </w:tc>
-        <w:tc>
-          <w:tcPr>
-            <w:tcW w:w="3760" w:type="dxa"/>
-          </w:tcPr>
-          <w:p>
-            <w:pPr>
-              <w:spacing w:after="20" w:line="240" w:lineRule="auto"/>
-            </w:pPr>
-          </w:p>
-        </w:tc>
-      </w:tr>
-      <w:tr>
-        <w:trPr>
-          <w:cantSplit/>
-        </w:trPr>
-        <w:tc>
-          <w:tcPr>
-            <w:tcW w:w="3000" w:type="dxa"/>
-          </w:tcPr>
-          <w:p>
-            <w:pPr>
-              <w:spacing w:after="20" w:line="240" w:lineRule="auto"/>
-            </w:pPr>
-            <w:r>
-              <w:rPr>
-                <w:b/>
-                <w:sz w:val="18"/>
-                <w:szCs w:val="18"/>
-              </w:rPr>
-              <w:t xml:space="preserve">Message Variant</w:t>
-            </w:r>
-          </w:p>
-        </w:tc>
-        <w:tc>
-          <w:tcPr>
-            <w:tcW w:w="2600" w:type="dxa"/>
-          </w:tcPr>
-          <w:p>
-            <w:pPr>
-              <w:spacing w:after="20" w:line="240" w:lineRule="auto"/>
-            </w:pPr>
-            <w:r>
-              <w:rPr>
-                <w:sz w:val="18"/>
-                <w:szCs w:val="18"/>
-              </w:rPr>
-              <w:t xml:space="preserve">HRS</w:t>
-            </w:r>
-          </w:p>
-        </w:tc>
-        <w:tc>
-          <w:tcPr>
-            <w:tcW w:w="3760" w:type="dxa"/>
-          </w:tcPr>
-          <w:p>
-            <w:pPr>
-              <w:spacing w:after="20" w:line="240" w:lineRule="auto"/>
-            </w:pPr>
-          </w:p>
-        </w:tc>
-      </w:tr>
-      <w:tr>
-        <w:trPr>
-          <w:cantSplit/>
-        </w:trPr>
-        <w:tc>
-          <w:tcPr>
-            <w:tcW w:w="3000" w:type="dxa"/>
-          </w:tcPr>
-          <w:p>
-            <w:pPr>
-              <w:spacing w:after="20" w:line="240" w:lineRule="auto"/>
-            </w:pPr>
-            <w:r>
-              <w:rPr>
-                <w:b/>
-                <w:sz w:val="18"/>
-                <w:szCs w:val="18"/>
-              </w:rPr>
-              <w:t xml:space="preserve">SADR addresses – Sender (SNDSAD)</w:t>
-            </w:r>
-          </w:p>
-        </w:tc>
-        <w:tc>
-          <w:tcPr>
-            <w:tcW w:w="2600" w:type="dxa"/>
-          </w:tcPr>
-          <w:p>
-            <w:pPr>
-              <w:spacing w:after="20" w:line="240" w:lineRule="auto"/>
-            </w:pPr>
-            <w:r>
-              <w:rPr>
-                <w:sz w:val="18"/>
-                <w:szCs w:val="18"/>
-              </w:rPr>
-              <w:t xml:space="preserve">HRS</w:t>
-            </w:r>
-          </w:p>
-        </w:tc>
-        <w:tc>
-          <w:tcPr>
-            <w:tcW w:w="3760" w:type="dxa"/>
-          </w:tcPr>
-          <w:p>
-            <w:pPr>
-              <w:spacing w:after="20" w:line="240" w:lineRule="auto"/>
-            </w:pPr>
-          </w:p>
-        </w:tc>
-      </w:tr>
-      <w:tr>
-        <w:trPr>
-          <w:cantSplit/>
-        </w:trPr>
-        <w:tc>
-          <w:tcPr>
-            <w:tcW w:w="3000" w:type="dxa"/>
-          </w:tcPr>
-          <w:p>
-            <w:pPr>
-              <w:spacing w:after="20" w:line="240" w:lineRule="auto"/>
-            </w:pPr>
-            <w:r>
-              <w:rPr>
-                <w:b/>
-                <w:sz w:val="18"/>
-                <w:szCs w:val="18"/>
-              </w:rPr>
-              <w:t xml:space="preserve">Partner tab</w:t>
-            </w:r>
-          </w:p>
-        </w:tc>
-        <w:tc>
-          <w:tcPr>
-            <w:tcW w:w="2600" w:type="dxa"/>
-          </w:tcPr>
-          <w:p>
-            <w:pPr>
-              <w:spacing w:after="20" w:line="240" w:lineRule="auto"/>
-            </w:pPr>
-            <w:r>
-              <w:rPr>
-                <w:sz w:val="18"/>
-                <w:szCs w:val="18"/>
-              </w:rPr>
-              <w:t xml:space="preserve">As for IFS_P2P_143</w:t>
-            </w:r>
-          </w:p>
-        </w:tc>
-        <w:tc>
-          <w:tcPr>
-            <w:tcW w:w="3760" w:type="dxa"/>
-          </w:tcPr>
-          <w:p>
-            <w:pPr>
-              <w:spacing w:after="20" w:line="240" w:lineRule="auto"/>
-            </w:pPr>
-            <w:r>
-              <w:rPr>
-                <w:sz w:val="18"/>
-                <w:szCs w:val="18"/>
-              </w:rPr>
-              <w:t xml:space="preserve">Recipient: iShift; Sender: TIBCO logical system (LS) – TBC</w:t>
+              <w:t xml:space="preserve">Address tab. Tungsten example: TUN</w:t>
             </w:r>
           </w:p>
         </w:tc>
@@ -10330,7 +9674,7 @@
         <w:spacing w:after="120" w:line="240" w:lineRule="auto"/>
       </w:pPr>
       <w:r>
-        <w:t xml:space="preserve">Below is the entry maintained in CAT01 Table for the HRS reconciliation / reclassification IDoc:</w:t>
+        <w:t xml:space="preserve">Below is the entry maintained in CAT01 Table for the HRS reclassification IDoc (IFS_P2P_144):</w:t>
       </w:r>
     </w:p>
     <w:tbl>
@@ -10378,7 +9722,7 @@
                 <w:sz w:val="18"/>
                 <w:szCs w:val="18"/>
               </w:rPr>
-              <w:t xml:space="preserve">Program Name</w:t>
+              <w:t>Program Name</w:t>
             </w:r>
           </w:p>
         </w:tc>
@@ -10397,7 +9741,7 @@
                 <w:sz w:val="18"/>
                 <w:szCs w:val="18"/>
               </w:rPr>
-              <w:t xml:space="preserve">Constant</w:t>
+              <w:t>Constant</w:t>
             </w:r>
           </w:p>
         </w:tc>
@@ -10416,7 +9760,7 @@
                 <w:sz w:val="18"/>
                 <w:szCs w:val="18"/>
               </w:rPr>
-              <w:t xml:space="preserve">Number</w:t>
+              <w:t>Number</w:t>
             </w:r>
           </w:p>
         </w:tc>
@@ -10435,7 +9779,7 @@
                 <w:sz w:val="18"/>
                 <w:szCs w:val="18"/>
               </w:rPr>
-              <w:t xml:space="preserve">Selection Value</w:t>
+              <w:t>Selection Value</w:t>
             </w:r>
           </w:p>
         </w:tc>
@@ -10454,7 +9798,7 @@
                 <w:sz w:val="18"/>
                 <w:szCs w:val="18"/>
               </w:rPr>
-              <w:t xml:space="preserve">Selection value</w:t>
+              <w:t>Selection value</w:t>
             </w:r>
           </w:p>
         </w:tc>
@@ -10476,7 +9820,7 @@
                 <w:sz w:val="18"/>
                 <w:szCs w:val="18"/>
               </w:rPr>
-              <w:t xml:space="preserve">ZPTP_AC_FI_INVOICE_PST</w:t>
+              <w:t>ZPTP_AC_FI_INVOICE_PST</w:t>
             </w:r>
           </w:p>
         </w:tc>
@@ -10493,7 +9837,7 @@
                 <w:sz w:val="18"/>
                 <w:szCs w:val="18"/>
               </w:rPr>
-              <w:t xml:space="preserve">CITIBANK</w:t>
+              <w:t>CITIBANK</w:t>
             </w:r>
           </w:p>
         </w:tc>
@@ -10510,7 +9854,7 @@
                 <w:sz w:val="18"/>
                 <w:szCs w:val="18"/>
               </w:rPr>
-              <w:t xml:space="preserve">1</w:t>
+              <w:t>1</w:t>
             </w:r>
           </w:p>
         </w:tc>
@@ -10527,7 +9871,7 @@
                 <w:sz w:val="18"/>
                 <w:szCs w:val="18"/>
               </w:rPr>
-              <w:t xml:space="preserve">INV</w:t>
+              <w:t>INV</w:t>
             </w:r>
           </w:p>
         </w:tc>
@@ -10544,7 +9888,7 @@
                 <w:sz w:val="18"/>
                 <w:szCs w:val="18"/>
               </w:rPr>
-              <w:t xml:space="preserve">HRS</w:t>
+              <w:t>HRS</w:t>
             </w:r>
           </w:p>
         </w:tc>
@@ -10560,19 +9904,11 @@
         <w:spacing w:after="120" w:line="240" w:lineRule="auto"/>
       </w:pPr>
       <w:r>
-        <w:t xml:space="preserve">Sender system HRS: the value 'HRS' must be available in the domain ZSYSTEM (field ZUT_T_CAT02-SYS_SRC), in the same way as 'CITIBANK' was added for IFS_P2P_115 (TBC).</w:t>
-      </w:r>
-    </w:p>
-    <w:p>
-      <w:pPr>
-        <w:spacing w:after="120" w:line="240" w:lineRule="auto"/>
-      </w:pPr>
-      <w:r>
         <w:rPr>
           <w:b/>
           <w:highlight w:val="yellow"/>
         </w:rPr>
-        <w:t xml:space="preserve">END OF CHANGE-</w:t>
+        <w:t>END OF CHANGE-</w:t>
       </w:r>
       <w:r>
         <w:rPr>
@@ -10713,10 +10049,10 @@
           <w:color w:val="000000"/>
           <w:lang w:val="en-IN"/>
         </w:rPr>
-        <w:t xml:space="preserve">This interface should be similar to Leo interface: IFS_P2P_072- Promo Items - Goods Receipt Replication interface from S4 to COUPA LEO. iDoc type and Message type already exists and will be reused (</w:t>
+        <w:t>This interface should be similar to Leo interface: IFS_P2P_072- Promo Items - Goods Receipt Replication interface from S4 to COUPA LEO. iDoc type and Message type already exists and will be reused (</w:t>
       </w:r>
       <w:r>
-        <w:t xml:space="preserve">MBGMCR04 &amp; MBGMCR</w:t>
+        <w:t>MBGMCR04 &amp; MBGMCR</w:t>
       </w:r>
       <w:r>
         <w:rPr>
@@ -10856,7 +10192,7 @@
         <w:rPr>
           <w:lang w:eastAsia="fr-FR"/>
         </w:rPr>
-        <w:t xml:space="preserve">OB_STM_PTN Stock Movement from S4 to Partner</w:t>
+        <w:t>OB_STM_PTN Stock Movement from S4 to Partner</w:t>
       </w:r>
     </w:p>
     <w:bookmarkEnd w:id="29"/>
@@ -10902,9 +10238,9 @@
             <o:lock v:ext="edit" aspectratio="t"/>
           </v:shapetype>
           <v:shape id="_x0000_i1025" type="#_x0000_t75" style="width:46.75pt;height:30.1pt" o:ole="">
-            <v:imagedata r:id="rId21" o:title=""/>
+            <v:imagedata r:id="rId23" o:title=""/>
           </v:shape>
-          <o:OLEObject Type="Embed" ProgID="Word.Document.12" ShapeID="_x0000_i1025" DrawAspect="Icon" ObjectID="_1853410529" r:id="rId22">
+          <o:OLEObject Type="Embed" ProgID="Word.Document.12" ShapeID="_x0000_i1025" DrawAspect="Icon" ObjectID="_1853568795" r:id="rId24">
             <o:FieldCodes>\s</o:FieldCodes>
           </o:OLEObject>
         </w:object>
@@ -10967,8 +10303,7 @@
           <w:rFonts w:cstheme="minorHAnsi"/>
           <w:lang w:eastAsia="fr-FR"/>
         </w:rPr>
-        <w:lastRenderedPageBreak/>
-        <w:t xml:space="preserve">GR creation/cancellation will be sent from iShift via iDoc, that will pass thoug Tibco iShift and eBuy iPaas, then replicated to eBuy Coupa.</w:t>
+        <w:t xml:space="preserve">GR creation/cancellation will be sent from iShift via iDoc, that will pass through Tibco iShift and eBuy iPaas, then replicated to eBuy Coupa.</w:t>
       </w:r>
     </w:p>
     <w:p>
@@ -10992,6 +10327,7 @@
       <w:bookmarkStart w:id="32" w:name="_Toc55828529"/>
       <w:bookmarkStart w:id="33" w:name="_Toc143435764"/>
       <w:r>
+        <w:lastRenderedPageBreak/>
         <w:t>Authority Checks and Controls Requirements</w:t>
       </w:r>
       <w:bookmarkEnd w:id="32"/>
@@ -11169,7 +10505,7 @@
           <w:color w:val="000000"/>
           <w:lang w:val="en-IN"/>
         </w:rPr>
-        <w:t xml:space="preserve">The IDoc monitoring will be handled through the AIF Tool.</w:t>
+        <w:t>The IDoc monitoring will be handled through the AIF Tool.</w:t>
       </w:r>
     </w:p>
     <w:p>
@@ -11250,7 +10586,7 @@
                 <w:szCs w:val="20"/>
                 <w:lang w:val="de-CH"/>
               </w:rPr>
-              <w:t xml:space="preserve">Tool Specification</w:t>
+              <w:t>Tool Specification</w:t>
             </w:r>
           </w:p>
         </w:tc>
@@ -11351,7 +10687,7 @@
               <w:spacing w:after="0" w:line="240" w:lineRule="auto"/>
             </w:pPr>
             <w:r>
-              <w:t xml:space="preserve"> SAP Allication Interface Framework</w:t>
+              <w:t> SAP Application Interface Framework</w:t>
             </w:r>
           </w:p>
         </w:tc>
@@ -11444,7 +10780,7 @@
               <w:rPr>
                 <w:lang w:val="en-US" w:eastAsia="en-US"/>
               </w:rPr>
-              <w:t xml:space="preserve">Test conditions and expected results (for GR creation (NCOGS)</w:t>
+              <w:t>Test conditions and expected results (for GR creation (NCOGS)</w:t>
             </w:r>
           </w:p>
           <w:p>
@@ -11651,7 +10987,7 @@
               <w:rPr>
                 <w:rFonts w:ascii="Times New Roman" w:hAnsi="Times New Roman" w:cs="Times New Roman"/>
               </w:rPr>
-              <w:t xml:space="preserve">Simulation of successful IDoc.</w:t>
+              <w:t>Simulation of successful IDoc.</w:t>
             </w:r>
           </w:p>
         </w:tc>
@@ -11744,7 +11080,7 @@
               <w:rPr>
                 <w:rFonts w:ascii="Times New Roman" w:hAnsi="Times New Roman" w:cs="Times New Roman"/>
               </w:rPr>
-              <w:t xml:space="preserve">ALEAUD idoc sent back to middleware</w:t>
+              <w:t>ALEAUD idoc sent back to middleware</w:t>
             </w:r>
           </w:p>
         </w:tc>
@@ -11776,7 +11112,6 @@
               <w:rPr>
                 <w:lang w:val="en-US"/>
               </w:rPr>
-              <w:lastRenderedPageBreak/>
               <w:t>2</w:t>
             </w:r>
           </w:p>
@@ -11856,7 +11191,9 @@
                 <w:rFonts w:ascii="Times New Roman" w:hAnsi="Times New Roman" w:cs="Times New Roman"/>
                 <w:lang w:val="en-US"/>
               </w:rPr>
-              <w:t>AIF Tool. Simulation of a good receipt IDoc with at least, one of its field wrongly maintained.</w:t>
+              <w:t xml:space="preserve">AIF Tool. Simulation of a good receipt IDoc with at least, one of its field </w:t>
+              <w:lastRenderedPageBreak/>
+              <w:t>wrongly maintained.</w:t>
             </w:r>
           </w:p>
         </w:tc>
@@ -11883,7 +11220,8 @@
                 <w:rFonts w:ascii="Times New Roman" w:hAnsi="Times New Roman" w:cs="Times New Roman"/>
                 <w:lang w:val="en-US"/>
               </w:rPr>
-              <w:t xml:space="preserve">Idoc file failed. Good receipt not posted and acknowledgment file sent back to IPAAS with error message.</w:t>
+              <w:lastRenderedPageBreak/>
+              <w:t>Idoc file failed. Good receipt not posted and acknowledgment file sent back to IPAAS with error message.</w:t>
             </w:r>
           </w:p>
           <w:p>
@@ -11908,6 +11246,7 @@
                 <w:rFonts w:ascii="Times New Roman" w:hAnsi="Times New Roman" w:cs="Times New Roman"/>
                 <w:lang w:val="en-US"/>
               </w:rPr>
+              <w:lastRenderedPageBreak/>
               <w:t>IDoc processed with error status (transaction AIF Tool)</w:t>
             </w:r>
           </w:p>
@@ -11960,7 +11299,7 @@
               <w:rPr>
                 <w:lang w:val="en-US" w:eastAsia="en-US"/>
               </w:rPr>
-              <w:t xml:space="preserve">Test conditions and expected results (for GR cancellation (NCOGS)</w:t>
+              <w:t>Test conditions and expected results (for GR cancellation (NCOGS)</w:t>
             </w:r>
           </w:p>
           <w:p>
@@ -12167,7 +11506,7 @@
               <w:rPr>
                 <w:rFonts w:ascii="Times New Roman" w:hAnsi="Times New Roman" w:cs="Times New Roman"/>
               </w:rPr>
-              <w:t xml:space="preserve">Simulation of successful IDoc.</w:t>
+              <w:t>Simulation of successful IDoc.</w:t>
             </w:r>
           </w:p>
         </w:tc>
@@ -12260,7 +11599,7 @@
               <w:rPr>
                 <w:rFonts w:ascii="Times New Roman" w:hAnsi="Times New Roman" w:cs="Times New Roman"/>
               </w:rPr>
-              <w:t xml:space="preserve">ALEAUD idoc sent back to middleware</w:t>
+              <w:t>ALEAUD idoc sent back to middleware</w:t>
             </w:r>
           </w:p>
         </w:tc>
@@ -12398,7 +11737,7 @@
                 <w:rFonts w:ascii="Times New Roman" w:hAnsi="Times New Roman" w:cs="Times New Roman"/>
                 <w:lang w:val="en-US"/>
               </w:rPr>
-              <w:t xml:space="preserve">Idoc file failed. Good receipt not posted and acknowledgment file sent back to IPAAS with error message.</w:t>
+              <w:t>Idoc file failed. Good receipt not posted and acknowledgment file sent back to IPAAS with error message.</w:t>
             </w:r>
           </w:p>
           <w:p>
@@ -12685,7 +12024,7 @@
               <w:rPr>
                 <w:rFonts w:ascii="Times New Roman" w:hAnsi="Times New Roman" w:cs="Times New Roman"/>
               </w:rPr>
-              <w:t xml:space="preserve">Simulation of successful IDoc.</w:t>
+              <w:t>Simulation of successful IDoc.</w:t>
             </w:r>
           </w:p>
         </w:tc>
@@ -12737,9 +12076,7 @@
                 <w:rFonts w:ascii="Times New Roman" w:hAnsi="Times New Roman" w:cs="Times New Roman"/>
                 <w:lang w:val="en-US"/>
               </w:rPr>
-              <w:t xml:space="preserve">To be done on AIF Tool. Simulation (Good receipt process) of a Good receipt IDoc with all the segments </w:t>
-              <w:lastRenderedPageBreak/>
-              <w:t>correctly maintained.</w:t>
+              <w:t>To be done on AIF Tool. Simulation (Good receipt process) of a Good receipt IDoc with all the segments correctly maintained.</w:t>
             </w:r>
           </w:p>
           <w:p>
@@ -12775,7 +12112,6 @@
                 <w:rFonts w:ascii="Times New Roman" w:hAnsi="Times New Roman" w:cs="Times New Roman"/>
                 <w:lang w:val="en-US"/>
               </w:rPr>
-              <w:lastRenderedPageBreak/>
               <w:t xml:space="preserve">IDoc finished with successful status (AIF Tool) and document posted. </w:t>
             </w:r>
           </w:p>
@@ -12887,7 +12223,9 @@
                 <w:rFonts w:ascii="Times New Roman" w:hAnsi="Times New Roman" w:cs="Times New Roman"/>
                 <w:lang w:val="en-US"/>
               </w:rPr>
-              <w:t xml:space="preserve">AIF Tool. Simulation of an IDoc with at least, one of its field wrongly maintained </w:t>
+              <w:t xml:space="preserve">AIF Tool. Simulation of an IDoc with at least, </w:t>
+              <w:lastRenderedPageBreak/>
+              <w:t xml:space="preserve">one of its field wrongly maintained </w:t>
             </w:r>
           </w:p>
         </w:tc>
@@ -12914,6 +12252,7 @@
                 <w:rFonts w:ascii="Times New Roman" w:hAnsi="Times New Roman" w:cs="Times New Roman"/>
                 <w:lang w:val="en-US"/>
               </w:rPr>
+              <w:lastRenderedPageBreak/>
               <w:t xml:space="preserve">Idoc file failed. </w:t>
             </w:r>
           </w:p>
@@ -12985,7 +12324,7 @@
         <w:rPr>
           <w:b/>
         </w:rPr>
-        <w:t xml:space="preserve">Beginning of change ISHRPM-285 – Test conditions and expected results (for HRS: IFS_P2P_143 incoming invoice and IFS_P2P_144 reclassification)</w:t>
+        <w:t>Beginning of change ISHRPM-285 – Test conditions and expected results (for HRS: IFS_P2P_143 incoming invoice and IFS_P2P_144 reclassification)</w:t>
       </w:r>
     </w:p>
     <w:tbl>
@@ -13033,7 +12372,7 @@
                 <w:sz w:val="16"/>
                 <w:szCs w:val="16"/>
               </w:rPr>
-              <w:t xml:space="preserve">Test #</w:t>
+              <w:t>Test #</w:t>
             </w:r>
           </w:p>
         </w:tc>
@@ -13052,7 +12391,7 @@
                 <w:sz w:val="16"/>
                 <w:szCs w:val="16"/>
               </w:rPr>
-              <w:t xml:space="preserve">Test Condition</w:t>
+              <w:t>Test Condition</w:t>
             </w:r>
           </w:p>
         </w:tc>
@@ -13071,7 +12410,7 @@
                 <w:sz w:val="16"/>
                 <w:szCs w:val="16"/>
               </w:rPr>
-              <w:t xml:space="preserve">Type (normal / exception / error)</w:t>
+              <w:t>Type (normal / exception / error)</w:t>
             </w:r>
           </w:p>
         </w:tc>
@@ -13090,7 +12429,7 @@
                 <w:sz w:val="16"/>
                 <w:szCs w:val="16"/>
               </w:rPr>
-              <w:t xml:space="preserve">Test Data</w:t>
+              <w:t>Test Data</w:t>
             </w:r>
           </w:p>
         </w:tc>
@@ -13109,7 +12448,7 @@
                 <w:sz w:val="16"/>
                 <w:szCs w:val="16"/>
               </w:rPr>
-              <w:t xml:space="preserve">Expected Result</w:t>
+              <w:t>Expected Result</w:t>
             </w:r>
           </w:p>
         </w:tc>
@@ -13131,7 +12470,7 @@
                 <w:sz w:val="16"/>
                 <w:szCs w:val="16"/>
               </w:rPr>
-              <w:t xml:space="preserve">1</w:t>
+              <w:t>1</w:t>
             </w:r>
           </w:p>
         </w:tc>
@@ -13148,7 +12487,7 @@
                 <w:sz w:val="16"/>
                 <w:szCs w:val="16"/>
               </w:rPr>
-              <w:t xml:space="preserve">IDoc INVOIC02 / ZINVOIC02_EXT with message variant HRS and SADR sender HRS</w:t>
+              <w:t>IDoc INVOIC02 / ZINVOIC02_EXT with message variant HRS and SADR sender HRS</w:t>
             </w:r>
           </w:p>
         </w:tc>
@@ -13165,7 +12504,7 @@
                 <w:sz w:val="16"/>
                 <w:szCs w:val="16"/>
               </w:rPr>
-              <w:t xml:space="preserve">Normal</w:t>
+              <w:t>Normal</w:t>
             </w:r>
           </w:p>
         </w:tc>
@@ -13182,7 +12521,7 @@
                 <w:sz w:val="16"/>
                 <w:szCs w:val="16"/>
               </w:rPr>
-              <w:t xml:space="preserve">IDoc generated by TIBCO from an HRS CDF3 file; partner profile maintained</w:t>
+              <w:t>IDoc generated by TIBCO from an HRS CDF3 file; partner profile maintained</w:t>
             </w:r>
           </w:p>
         </w:tc>
@@ -13199,7 +12538,7 @@
                 <w:sz w:val="16"/>
                 <w:szCs w:val="16"/>
               </w:rPr>
-              <w:t xml:space="preserve">IDoc accepted (Typinfo: INVOIC02, ZINVOIC02_EXT, INVOIC, variant HRS; Address sender HRS), routed to SAP VIM and document posted.</w:t>
+              <w:t>IDoc accepted (Typinfo: INVOIC02, ZINVOIC02_EXT, INVOIC, variant HRS; Address sender HRS), routed to SAP VIM and document posted.</w:t>
             </w:r>
           </w:p>
         </w:tc>
@@ -13221,7 +12560,7 @@
                 <w:sz w:val="16"/>
                 <w:szCs w:val="16"/>
               </w:rPr>
-              <w:t xml:space="preserve">2</w:t>
+              <w:t>2</w:t>
             </w:r>
           </w:p>
         </w:tc>
@@ -13238,7 +12577,7 @@
                 <w:sz w:val="16"/>
                 <w:szCs w:val="16"/>
               </w:rPr>
-              <w:t xml:space="preserve">IDoc ACC_DOCUMENT04 with message variant HRS and SADR sender HRS</w:t>
+              <w:t>IDoc ACC_DOCUMENT04 with message variant HRS and SADR sender HRS</w:t>
             </w:r>
           </w:p>
         </w:tc>
@@ -13255,7 +12594,7 @@
                 <w:sz w:val="16"/>
                 <w:szCs w:val="16"/>
               </w:rPr>
-              <w:t xml:space="preserve">Normal</w:t>
+              <w:t>Normal</w:t>
             </w:r>
           </w:p>
         </w:tc>
@@ -13272,7 +12611,7 @@
                 <w:sz w:val="16"/>
                 <w:szCs w:val="16"/>
               </w:rPr>
-              <w:t xml:space="preserve">Reclassification IDoc (IFS_P2P_144)</w:t>
+              <w:t>Reclassification IDoc (IFS_P2P_144)</w:t>
             </w:r>
           </w:p>
         </w:tc>
@@ -13289,7 +12628,7 @@
                 <w:sz w:val="16"/>
                 <w:szCs w:val="16"/>
               </w:rPr>
-              <w:t xml:space="preserve">IDoc finished with successful status (AIF Tool) and document posted.</w:t>
+              <w:t>IDoc finished with successful status (AIF Tool) and document posted.</w:t>
             </w:r>
           </w:p>
         </w:tc>
@@ -13311,7 +12650,7 @@
                 <w:sz w:val="16"/>
                 <w:szCs w:val="16"/>
               </w:rPr>
-              <w:t xml:space="preserve">3</w:t>
+              <w:t>3</w:t>
             </w:r>
           </w:p>
         </w:tc>
@@ -13328,7 +12667,7 @@
                 <w:sz w:val="16"/>
                 <w:szCs w:val="16"/>
               </w:rPr>
-              <w:t xml:space="preserve">Wrong IDoc (unknown message variant or sender)</w:t>
+              <w:t>Wrong IDoc (unknown message variant or sender)</w:t>
             </w:r>
           </w:p>
         </w:tc>
@@ -13345,7 +12684,7 @@
                 <w:sz w:val="16"/>
                 <w:szCs w:val="16"/>
               </w:rPr>
-              <w:t xml:space="preserve">Error</w:t>
+              <w:t>Error</w:t>
             </w:r>
           </w:p>
         </w:tc>
@@ -13362,7 +12701,7 @@
                 <w:sz w:val="16"/>
                 <w:szCs w:val="16"/>
               </w:rPr>
-              <w:t xml:space="preserve">IDoc with variant or SADR sender different from HRS</w:t>
+              <w:t>IDoc with variant or SADR sender different from HRS</w:t>
             </w:r>
           </w:p>
         </w:tc>
@@ -13379,7 +12718,7 @@
                 <w:sz w:val="16"/>
                 <w:szCs w:val="16"/>
               </w:rPr>
-              <w:t xml:space="preserve">IDoc processed with error status (AIF Tool); document not posted.</w:t>
+              <w:t>IDoc processed with error status (AIF Tool); document not posted.</w:t>
             </w:r>
           </w:p>
         </w:tc>
@@ -13393,14 +12732,14 @@
         <w:rPr>
           <w:b/>
         </w:rPr>
-        <w:t xml:space="preserve">End of change ISHRPM-285</w:t>
+        <w:t>End of change ISHRPM-285</w:t>
       </w:r>
     </w:p>
     <w:sectPr>
-      <w:headerReference w:type="even" r:id="rId23"/>
-      <w:headerReference w:type="default" r:id="rId24"/>
-      <w:footerReference w:type="default" r:id="rId25"/>
-      <w:headerReference w:type="first" r:id="rId26"/>
+      <w:headerReference w:type="even" r:id="rId25"/>
+      <w:headerReference w:type="default" r:id="rId26"/>
+      <w:footerReference w:type="default" r:id="rId27"/>
+      <w:headerReference w:type="first" r:id="rId28"/>
       <w:pgSz w:w="12240" w:h="15840"/>
       <w:pgMar w:top="1440" w:right="1440" w:bottom="1440" w:left="1440" w:header="720" w:footer="720" w:gutter="0"/>
       <w:cols w:space="720"/>
@@ -18386,7 +17725,7 @@
 </file>
 
 <file path=word/diagrams/colors1.xml><?xml version="1.0" encoding="utf-8"?>
-<dgm:colorsDef xmlns:dgm="http://schemas.openxmlformats.org/drawingml/2006/diagram" xmlns:a="http://schemas.openxmlformats.org/drawingml/2006/main" uniqueId="urn:microsoft.com/office/officeart/2005/8/colors/accent1_2">
+<dgm:colorsDef xmlns:dgm="http://schemas.openxmlformats.org/drawingml/2006/diagram" xmlns:a="http://schemas.openxmlformats.org/drawingml/2006/main" uniqueId="urn:microsoft.com/office/officeart/2005/8/colors/accent1_2#1">
   <dgm:title val=""/>
   <dgm:desc val=""/>
   <dgm:catLst>
@@ -19136,7 +18475,7 @@
 <dgm:dataModel xmlns:dgm="http://schemas.openxmlformats.org/drawingml/2006/diagram" xmlns:a="http://schemas.openxmlformats.org/drawingml/2006/main">
   <dgm:ptLst>
     <dgm:pt modelId="{144BEC76-D21E-4AC0-968B-D489CFCECA49}" type="doc">
-      <dgm:prSet loTypeId="urn:microsoft.com/office/officeart/2005/8/layout/process1" loCatId="process" qsTypeId="urn:microsoft.com/office/officeart/2005/8/quickstyle/simple4" qsCatId="simple" csTypeId="urn:microsoft.com/office/officeart/2005/8/colors/accent1_2" csCatId="accent1" phldr="1"/>
+      <dgm:prSet loTypeId="urn:microsoft.com/office/officeart/2005/8/layout/process1" loCatId="process" qsTypeId="urn:microsoft.com/office/officeart/2005/8/quickstyle/simple4#1" qsCatId="simple" csTypeId="urn:microsoft.com/office/officeart/2005/8/colors/accent1_2#1" csCatId="accent1" phldr="1"/>
       <dgm:spPr/>
     </dgm:pt>
     <dgm:pt modelId="{689ECAB6-AE5D-4C29-AD3B-F9D92678C96A}">
@@ -19416,7 +18755,7 @@
   <dgm:whole/>
   <dgm:extLst>
     <a:ext uri="http://schemas.microsoft.com/office/drawing/2008/diagram">
-      <dsp:dataModelExt xmlns:dsp="http://schemas.microsoft.com/office/drawing/2008/diagram" relId="rId16" minVer="http://schemas.openxmlformats.org/drawingml/2006/diagram"/>
+      <dsp:dataModelExt xmlns:dsp="http://schemas.microsoft.com/office/drawing/2008/diagram" relId="rId18" minVer="http://schemas.openxmlformats.org/drawingml/2006/diagram"/>
     </a:ext>
   </dgm:extLst>
 </dgm:dataModel>
@@ -20315,7 +19654,7 @@
 </file>
 
 <file path=word/diagrams/quickStyle1.xml><?xml version="1.0" encoding="utf-8"?>
-<dgm:styleDef xmlns:dgm="http://schemas.openxmlformats.org/drawingml/2006/diagram" xmlns:a="http://schemas.openxmlformats.org/drawingml/2006/main" uniqueId="urn:microsoft.com/office/officeart/2005/8/quickstyle/simple4">
+<dgm:styleDef xmlns:dgm="http://schemas.openxmlformats.org/drawingml/2006/diagram" xmlns:a="http://schemas.openxmlformats.org/drawingml/2006/main" uniqueId="urn:microsoft.com/office/officeart/2005/8/quickstyle/simple4#1">
   <dgm:title val=""/>
   <dgm:desc val=""/>
   <dgm:catLst>

</xml_diff>